<commit_message>
Motor de reglas, RAG multi-consulta, guardrail de citas y evaluación IE6
- policy_engine.py: aplica Art. 1, 3, 4, 5 y 11 del manual (estado determinista)
- Recuperación por sub-consultas por dimensión de riesgo (recall 17,1% -> 100%)
- Verificación de citas contra fragmentos recuperados y control de estado del LLM
- Evaluador con 7 casos y métricas de coherencia; 17 pruebas unittest
- Fallback de indicadores al último valor real en caché; formato numérico chileno
- Informe Word, README, arquitectura, guion, diagramas y evidencias actualizados

Co-Authored-By: Claude Opus 5.5 <noreply@anthropic.com>
Claude-Session: https://claude.ai/code/session_01JCmwPz6uvKDr1htzz1Jdys
</commit_message>
<xml_diff>
--- a/docs/INFORME_TECNICO_SOLUCION_RAG.docx
+++ b/docs/INFORME_TECNICO_SOLUCION_RAG.docx
@@ -14,41 +14,39 @@
         </w:rPr>
         <w:t>ISY0101 - INGENIERÍA DE SOLUCIONES CON IA | DUOC UC</w:t>
         <w:br/>
-        <w:t>EVALUACIÓN PARCIAL N°1 - ENCARGO CON PRESENTACIÓN</w:t>
+        <w:t>EVALUACIÓN PARCIAL N°1 - ENCARGO</w:t>
       </w:r>
     </w:p>
     <w:p>
       <w:pPr>
-        <w:spacing w:before="120" w:after="40"/>
+        <w:spacing w:after="40"/>
       </w:pPr>
       <w:r>
         <w:rPr>
           <w:b/>
           <w:color w:val="003399"/>
-          <w:sz w:val="34"/>
+          <w:sz w:val="32"/>
         </w:rPr>
-        <w:t>Diseño e Implementación de Solución Agéntica con LLM y RAG:</w:t>
-        <w:br/>
-        <w:t>Asesor Financiero y de Garantías PYME ('PYME-Advisor')</w:t>
+        <w:t>PYME-Advisor: Agente con LLM y RAG para la Pre-Evaluación Crediticia de PYMEs en BancoEstado Microempresas</w:t>
       </w:r>
     </w:p>
     <w:p>
       <w:pPr>
-        <w:spacing w:after="240"/>
+        <w:spacing w:after="160"/>
       </w:pPr>
       <w:r>
         <w:rPr>
           <w:i/>
           <w:color w:val="646464"/>
-          <w:sz w:val="19"/>
+          <w:sz w:val="18"/>
         </w:rPr>
-        <w:t>Caso de Estudio: BancoEstado Microempresas | Integrantes: Juan Serna, Bárbara Bustamante, Nelson Carrasco | Fecha: Septiembre 2026</w:t>
+        <w:t>Integrantes: Juan Serna, Bárbara Bustamante, Nelson Carrasco | Fecha: 25 de septiembre de 2026 | Repositorio: https://github.com/nelscarrasco/PYME-Advisor_ISY0101_BancoEstado</w:t>
       </w:r>
     </w:p>
     <w:p>
       <w:pPr>
         <w:pStyle w:val="Heading1"/>
-        <w:spacing w:before="200" w:after="80"/>
+        <w:spacing w:before="160" w:after="60"/>
       </w:pPr>
       <w:r>
         <w:rPr>
@@ -56,55 +54,139 @@
           <w:color w:val="003399"/>
           <w:sz w:val="24"/>
         </w:rPr>
-        <w:t>1. Análisis del Caso Organizacional y Requerimientos de IA (IE1)</w:t>
+        <w:t>1. Análisis del Caso Organizacional y Requerimientos (IE1)</w:t>
       </w:r>
     </w:p>
     <w:p>
       <w:pPr>
         <w:spacing w:after="80"/>
-      </w:pPr>
-      <w:r>
-        <w:t>En Chile, las micro y pequeñas empresas representan el 98,6% del tejido productivo formal, pero sufren una fricción crediticia superior al 45% debido a la complejidad en la interpretación de los manuales de riesgo comercial y al cálculo manual de balances indexados en Unidades de Fomento (UF) (Ministerio de Economía, 2024). En BancoEstado Microempresas, principal entidad de fomento e inclusión financiera del país, el levantamiento manual de antecedentes en sucursales genera demoras de entre 7 y 10 días hábiles por prospecto. La sobrecarga de los ejecutivos conduce frecuentemente a interpretaciones dispares de las normativas de apalancamiento (leverage), morosidad en el Boletín Comercial y elegibilidad para fondos estatales de fianza como FOGAPE.</w:t>
-      </w:r>
-    </w:p>
-    <w:p>
-      <w:pPr>
-        <w:spacing w:after="120"/>
-      </w:pPr>
-      <w:r>
-        <w:rPr>
-          <w:color w:val="282828"/>
-        </w:rPr>
-        <w:t xml:space="preserve">Para abordar este problema, se diseñó e implementó </w:t>
-      </w:r>
-      <w:r>
-        <w:rPr>
-          <w:b/>
-        </w:rPr>
-        <w:t>PYME-Advisor</w:t>
-      </w:r>
-      <w:r>
-        <w:t>, una solución de software inteligente basada en un agente autónomo LLM con arquitectura RAG (Retrieval-Augmented Generation) y herramientas de consulta en tiempo real. Los objetivos específicos de la intervención son: (1) reducir el tiempo de respuesta preliminar de 7 días a menos de 2 segundos; (2) asegurar un índice de fidelidad normativa (groundedness) superior al 95% para eliminar alucinaciones en condiciones de crédito; (3) integrar la API pública mindicador.cl (indicadores publicados por el Banco Central de Chile) para resolver la indexación dinámica de UF a pesos chilenos ($CLP); y (4) personalizar el dictamen recomendando el producto financiero idóneo (Capital de Trabajo, Leasing o Factoring).</w:t>
-      </w:r>
-    </w:p>
-    <w:p>
-      <w:pPr>
-        <w:spacing w:after="120"/>
+        <w:jc w:val="both"/>
       </w:pPr>
       <w:r>
         <w:rPr>
           <w:b/>
         </w:rPr>
-        <w:t xml:space="preserve">Alcance del caso: </w:t>
+        <w:t xml:space="preserve">Organización. </w:t>
       </w:r>
       <w:r>
-        <w:t>la organización es real, pero el Manual de Políticas de Crédito, el Catálogo de Productos y la base de clientes son documentos simulados construidos por el equipo para el prototipo; no corresponden a normativa interna oficial de BancoEstado. Los tiempos de proceso actuales (7 a 10 días) son un supuesto de diseño del equipo.</w:t>
+        <w:rPr>
+          <w:b w:val="0"/>
+        </w:rPr>
+        <w:t>BancoEstado Microempresas es la filial de BancoEstado orientada al financiamiento de micro y pequeñas empresas en todo Chile, con productos de capital de trabajo, leasing y factoring y acceso a garantías estatales como FOGAPE. Las MiPymes superan 1,2 millones de empresas, representan el 98,5% de las empresas formales del país y concentran el 48% del empleo (Ministerio de Economía, Fomento y Turismo, 2026), por lo que la velocidad y consistencia con que se evalúa su acceso al crédito tiene impacto directo.</w:t>
+      </w:r>
+    </w:p>
+    <w:p>
+      <w:pPr>
+        <w:spacing w:after="80"/>
+        <w:jc w:val="both"/>
+      </w:pPr>
+      <w:r>
+        <w:rPr>
+          <w:b/>
+        </w:rPr>
+        <w:t xml:space="preserve">Problema. </w:t>
+      </w:r>
+      <w:r>
+        <w:rPr>
+          <w:b w:val="0"/>
+        </w:rPr>
+        <w:t>La pre-evaluación inicial de una solicitud exige que el ejecutivo cruce manualmente tres fuentes: (a) el manual interno de políticas de riesgo (antigüedad, morosidad, endeudamiento, garantías y atribuciones), (b) los antecedentes del cliente y (c) indicadores que cambian a diario, como la UF, en la que se expresan montos y tramos. Esto produce demoras, criterios dispares entre ejecutivos y errores de conversión UF–CLP. Un LLM genérico no resuelve el problema: desconoce las políticas internas, no conoce la UF del día y puede inventar requisitos.</w:t>
+      </w:r>
+    </w:p>
+    <w:p>
+      <w:pPr>
+        <w:spacing w:after="80"/>
+        <w:jc w:val="both"/>
+      </w:pPr>
+      <w:r>
+        <w:rPr>
+          <w:b/>
+        </w:rPr>
+        <w:t xml:space="preserve">Alcance. </w:t>
+      </w:r>
+      <w:r>
+        <w:rPr>
+          <w:b w:val="0"/>
+        </w:rPr>
+        <w:t>La organización es real, pero el Manual de Políticas de Crédito (11 artículos), el Catálogo de Productos (4 secciones) y la base de 5 clientes son documentos simulados construidos por el equipo; no son normativa oficial de BancoEstado.</w:t>
+      </w:r>
+    </w:p>
+    <w:p>
+      <w:pPr>
+        <w:spacing w:after="20"/>
+        <w:jc w:val="both"/>
+      </w:pPr>
+      <w:r>
+        <w:rPr>
+          <w:b/>
+        </w:rPr>
+        <w:t>Requerimientos y objetivos medibles:</w:t>
+      </w:r>
+    </w:p>
+    <w:p>
+      <w:pPr>
+        <w:pStyle w:val="ListBullet"/>
+        <w:spacing w:after="20"/>
+      </w:pPr>
+      <w:r>
+        <w:rPr>
+          <w:b/>
+        </w:rPr>
+        <w:t xml:space="preserve">R1 Dictamen preliminar trazable: </w:t>
+      </w:r>
+      <w:r>
+        <w:t>estado PRE-ADMISIBLE / NO ADMISIBLE / COMITÉ en menos de 2 s, sin emitir aprobaciones definitivas.</w:t>
+      </w:r>
+    </w:p>
+    <w:p>
+      <w:pPr>
+        <w:pStyle w:val="ListBullet"/>
+        <w:spacing w:after="20"/>
+      </w:pPr>
+      <w:r>
+        <w:rPr>
+          <w:b/>
+        </w:rPr>
+        <w:t xml:space="preserve">R2 Fidelidad normativa: </w:t>
+      </w:r>
+      <w:r>
+        <w:t>100% de las citas del dictamen respaldadas por un fragmento recuperado del manual (meta mínima 95%).</w:t>
+      </w:r>
+    </w:p>
+    <w:p>
+      <w:pPr>
+        <w:pStyle w:val="ListBullet"/>
+        <w:spacing w:after="20"/>
+      </w:pPr>
+      <w:r>
+        <w:rPr>
+          <w:b/>
+        </w:rPr>
+        <w:t xml:space="preserve">R3 Datos externos vigentes: </w:t>
+      </w:r>
+      <w:r>
+        <w:t>conversión UF→CLP exacta con el valor del día obtenido por API, con continuidad si la API falla.</w:t>
+      </w:r>
+    </w:p>
+    <w:p>
+      <w:pPr>
+        <w:pStyle w:val="ListBullet"/>
+        <w:spacing w:after="80"/>
+      </w:pPr>
+      <w:r>
+        <w:rPr>
+          <w:b/>
+        </w:rPr>
+        <w:t xml:space="preserve">R4 Control de riesgo: </w:t>
+      </w:r>
+      <w:r>
+        <w:t>derivación automática al Comité en los supuestos del Art. 11 y respeto al secreto bancario y a la Ley 19.628 (sólo se envían al modelo los campos necesarios del cliente).</w:t>
       </w:r>
     </w:p>
     <w:p>
       <w:pPr>
         <w:pStyle w:val="Heading1"/>
-        <w:spacing w:before="200" w:after="80"/>
+        <w:spacing w:before="160" w:after="60"/>
       </w:pPr>
       <w:r>
         <w:rPr>
@@ -112,21 +194,24 @@
           <w:color w:val="003399"/>
           <w:sz w:val="24"/>
         </w:rPr>
-        <w:t>2. Formulación y Justificación de Prompts Optimizados (IE2)</w:t>
+        <w:t>2. Formulación de Prompts (IE2)</w:t>
       </w:r>
     </w:p>
     <w:p>
       <w:pPr>
-        <w:spacing w:after="80"/>
+        <w:spacing w:after="60"/>
+        <w:jc w:val="both"/>
       </w:pPr>
       <w:r>
-        <w:t>El diseño del prompt del sistema (System Prompt) y las directrices de inferencia se fundamentan en técnicas de Prompt Engineering estructurado, integrando definición de rol experto, guardrails de prudencia financiera y aprendizaje contextual en pocas muestras (Few-Shot Prompting):</w:t>
+        <w:rPr>
+          <w:b w:val="0"/>
+        </w:rPr>
+        <w:t>El prompt se ensambla en src/agent/prompts.py en bloques ordenados: (1) system prompt con rol y reglas, (2) ejemplo few-shot de un dictamen completo, (3) memoria de sesión, (4) indicadores de la API, (5) perfil del cliente, (6) fragmentos RAG con fuente y relevancia, (7) resultado del motor de reglas y (8) la consulta. Extracto del system prompt:</w:t>
       </w:r>
     </w:p>
     <w:tbl>
       <w:tblPr>
         <w:tblW w:type="auto" w:w="0"/>
-        <w:jc w:val="center"/>
         <w:tblLook w:firstColumn="1" w:firstRow="1" w:lastColumn="0" w:lastRow="0" w:noHBand="0" w:noVBand="1" w:val="04A0"/>
       </w:tblPr>
       <w:tblGrid>
@@ -139,24 +224,24 @@
             <w:shd w:fill="F1F5F9"/>
           </w:tcPr>
           <w:p>
-            <w:pPr>
-              <w:spacing w:before="60" w:after="60"/>
-            </w:pPr>
             <w:r>
               <w:rPr>
                 <w:rFonts w:ascii="Consolas" w:hAnsi="Consolas"/>
-                <w:color w:val="1E293B"/>
-                <w:sz w:val="17"/>
+                <w:sz w:val="16"/>
               </w:rPr>
               <w:t>Eres "PYME-Advisor", Agente Consultor de Riesgo Crediticio de BancoEstado Microempresas.</w:t>
               <w:br/>
-              <w:t>1. PRINCIPIO DE FIDELIDAD (GROUNDEDNESS): Basa tus conclusiones EXCLUSIVAMENTE en el contexto normativo provisto. Prohibido inventar condiciones o montos. Si un caso excede la norma, deriva al Comité Especial (Art. 11).</w:t>
+              <w:t>1. FIDELIDAD: basa tus conclusiones EXCLUSIVAMENTE en el contexto provisto; PROHIBIDO inventar requisitos, plazos o montos.</w:t>
               <w:br/>
-              <w:t>2. TRAZABILIDAD: Cita siempre la fuente y artículo [Manual de Crédito, Art. X] o [API mindicador.cl / CMF].</w:t>
+              <w:t xml:space="preserve">   Si el caso no está en el manual: "debe elevarse a evaluación especial".</w:t>
               <w:br/>
-              <w:t>3. CONVERSIÓN EN TIEMPO REAL: Convierte montos en UF a $CLP multiplicando por el valor oficial de la API.</w:t>
+              <w:t>2. TRAZABILIDAD: toda afirmación normativa cita [Manual de Crédito, Art. X] o [Catálogo de Productos, Sección N].</w:t>
               <w:br/>
-              <w:t>4. ESTRUCTURA: Entrega 5 secciones: 1) Dictamen, 2) Fundamentación RAG, 3) FOGAPE, 4) Producto, 5) Pasos.</w:t>
+              <w:t>3. DATOS EXTERNOS: convierte todo monto UF a CLP con el valor de la API y cita la fuente.</w:t>
+              <w:br/>
+              <w:t>4. ESTADO: debe coincidir con el MOTOR DE REGLAS; explícalo, no lo recalcules. Nunca emitas aprobación definitiva.</w:t>
+              <w:br/>
+              <w:t>5. FORMATO: 1) Dictamen 2) Fundamentación 3) Garantías/FOGAPE 4) Producto 5) Documentación.</w:t>
             </w:r>
           </w:p>
         </w:tc>
@@ -164,22 +249,31 @@
     </w:tbl>
     <w:p>
       <w:pPr>
-        <w:spacing w:before="80" w:after="120"/>
+        <w:spacing w:after="0"/>
+      </w:pPr>
+    </w:p>
+    <w:p>
+      <w:pPr>
+        <w:spacing w:after="80"/>
+        <w:jc w:val="both"/>
       </w:pPr>
       <w:r>
         <w:rPr>
           <w:b/>
         </w:rPr>
-        <w:t xml:space="preserve">Justificación Técnica: </w:t>
+        <w:t xml:space="preserve">Justificación. </w:t>
       </w:r>
       <w:r>
-        <w:t>La asignación de persona fija el registro lingüístico formal exigido en la banca comercial. Los guardrails negativos impiden legalmente comprometer aprobaciones finales fuera de política, mientras que la obligatoriedad de citar artículos garantiza auditabilidad regulatoria ante la CMF. Los ejemplos Few-Shot condicionan al modelo a estructurar su respuesta en un esquema de cinco puntos invariable, mitigando la dispersión estocástica de los LLMs.</w:t>
+        <w:rPr>
+          <w:b w:val="0"/>
+        </w:rPr>
+        <w:t>El rol fija el registro y el umbral de prudencia bancaria. Las restricciones negativas y la cláusula de escape ("elevar a evaluación especial") reducen el espacio de respuesta a lo que el contexto respalda. La cita obligatoria con formato fijo permite verificar automáticamente cada afirmación (sección 5). Entregar al modelo el resultado del motor de reglas evita que el LLM decida el estado crediticio, que es la parte con mayor riesgo regulatorio. El few-shot y la temperatura 0,1 estabilizan el formato de 5 secciones.</w:t>
       </w:r>
     </w:p>
     <w:p>
       <w:pPr>
         <w:pStyle w:val="Heading1"/>
-        <w:spacing w:before="200" w:after="80"/>
+        <w:spacing w:before="160" w:after="60"/>
       </w:pPr>
       <w:r>
         <w:rPr>
@@ -187,61 +281,52 @@
           <w:color w:val="003399"/>
           <w:sz w:val="24"/>
         </w:rPr>
-        <w:t>3. Diseño e Implementación del Pipeline RAG y Fuentes de Datos (IE3)</w:t>
+        <w:t>3. Diseño e Implementación del Pipeline RAG (IE3)</w:t>
       </w:r>
     </w:p>
     <w:p>
       <w:pPr>
-        <w:spacing w:after="80"/>
-      </w:pPr>
-      <w:r>
-        <w:t>El flujo RAG implementado desacopla eficientemente dos tipos de fuentes de datos para enriquecer la respuesta del agente:</w:t>
-      </w:r>
-    </w:p>
-    <w:p>
-      <w:pPr>
-        <w:spacing w:after="40"/>
+        <w:pStyle w:val="ListBullet"/>
+        <w:spacing w:after="20"/>
       </w:pPr>
       <w:r>
         <w:rPr>
           <w:b/>
         </w:rPr>
-        <w:t xml:space="preserve">• Fuentes Internas: </w:t>
+        <w:t xml:space="preserve">Fuentes internas: </w:t>
       </w:r>
       <w:r>
-        <w:t xml:space="preserve">Se integró el Manual Institucional de Políticas de Crédito PYME (11 Artículos que regulan antigüedad, límites de endeudamiento leverage, exclusiones de DICOM y garantías) y el Catálogo de 4 Productos Comerciales. La fragmentación se realizó mediante un algoritmo de </w:t>
-      </w:r>
-      <w:r>
-        <w:rPr>
-          <w:b/>
-        </w:rPr>
-        <w:t>Semantic &amp; Hierarchical Chunking</w:t>
-      </w:r>
-      <w:r>
-        <w:t xml:space="preserve"> que respeta la estructura de artículos legales y títulos (26 fragmentos con metadatos de sección y fuente), indexados en un Vector Store con matriz TF-IDF sublineal con n-gramas (1 a 3) y similitud de coseno, logrando búsquedas semánticas deterministas de 0,002 segundos.</w:t>
+        <w:t>Manual de Crédito y Catálogo (Markdown) segmentados por encabezado y artículo (chunker.py), generando 27 fragmentos con metadatos de fuente, título y artículo/sección; base de clientes JSON consultada por RUT (ClientLookupTool).</w:t>
       </w:r>
     </w:p>
     <w:p>
       <w:pPr>
-        <w:spacing w:after="120"/>
+        <w:pStyle w:val="ListBullet"/>
+        <w:spacing w:after="20"/>
       </w:pPr>
       <w:r>
         <w:rPr>
           <w:b/>
         </w:rPr>
-        <w:t xml:space="preserve">• Fuentes Externas en Tiempo Real: </w:t>
+        <w:t xml:space="preserve">Fuente externa: </w:t>
       </w:r>
       <w:r>
-        <w:t xml:space="preserve">Se desarrolló la herramienta </w:t>
+        <w:t>API pública mindicador.cl (valores del Banco Central de Chile) para UF, dólar y UTM (EconomicIndicatorsTool), con caché de 1 hora; si la API falla usa el último valor real guardado y, en último caso, valores de contingencia, informando siempre la fuente usada.</w:t>
       </w:r>
+    </w:p>
+    <w:p>
+      <w:pPr>
+        <w:pStyle w:val="ListBullet"/>
+        <w:spacing w:after="60"/>
+      </w:pPr>
       <w:r>
         <w:rPr>
           <w:b/>
         </w:rPr>
-        <w:t>EconomicIndicatorsTool</w:t>
+        <w:t xml:space="preserve">Índice y búsqueda: </w:t>
       </w:r>
       <w:r>
-        <w:t xml:space="preserve"> que consulta en tiempo real la API pública mindicador.cl (valores del Banco Central de Chile), recuperando los valores actualizados de la UF ($41.008,10 CLP), Dólar Observado y UTM. Incluye una capa de caché local con tiempo de expiración (TTL = 1 hora) y contingencia normativa en disco para resiliencia ante cortes de conectividad externa.</w:t>
+        <w:t>TF-IDF con n-gramas 1–3 y similitud coseno (vector_store.py). La consulta se descompone en sub-consultas por dimensión de riesgo (segmento, antigüedad, morosidad, endeudamiento, FOGAPE, garantías, producto, documentos y comité), se recupera el top-1/2 de cada una y se unen sin duplicados.</w:t>
       </w:r>
     </w:p>
     <w:p>
@@ -252,7 +337,7 @@
       <w:r>
         <w:drawing>
           <wp:inline xmlns:a="http://schemas.openxmlformats.org/drawingml/2006/main" xmlns:pic="http://schemas.openxmlformats.org/drawingml/2006/picture">
-            <wp:extent cx="4937760" cy="2248206"/>
+            <wp:extent cx="4572000" cy="2020455"/>
             <wp:docPr id="1" name="Picture 1"/>
             <wp:cNvGraphicFramePr>
               <a:graphicFrameLocks noChangeAspect="1"/>
@@ -273,7 +358,7 @@
                   <pic:spPr>
                     <a:xfrm>
                       <a:off x="0" y="0"/>
-                      <a:ext cx="4937760" cy="2248206"/>
+                      <a:ext cx="4572000" cy="2020455"/>
                     </a:xfrm>
                     <a:prstGeom prst="rect"/>
                   </pic:spPr>
@@ -295,13 +380,13 @@
           <w:color w:val="5A5A5A"/>
           <w:sz w:val="17"/>
         </w:rPr>
-        <w:t>Figura 1. Flujo de información del pipeline RAG: fuentes internas (base de clientes, manual y catálogo) y externa (API de indicadores) integradas en el prompt.</w:t>
+        <w:t>Figura 1. Flujo de información por consulta: herramientas internas y externas, motor de reglas, recuperación multi-consulta, generación y verificación.</w:t>
       </w:r>
     </w:p>
     <w:p>
       <w:pPr>
         <w:pStyle w:val="Heading1"/>
-        <w:spacing w:before="200" w:after="80"/>
+        <w:spacing w:before="160" w:after="60"/>
       </w:pPr>
       <w:r>
         <w:rPr>
@@ -309,15 +394,7 @@
           <w:color w:val="003399"/>
           <w:sz w:val="24"/>
         </w:rPr>
-        <w:t>4. Arquitectura de la Solución y Gestión de Contexto (IE4, IE7)</w:t>
-      </w:r>
-    </w:p>
-    <w:p>
-      <w:pPr>
-        <w:spacing w:after="80"/>
-      </w:pPr>
-      <w:r>
-        <w:t>La arquitectura global desacopla cuatro capas funcionales: (1) Capa de Interfaz (Consola CLI y Dashboard Web interactivo FastAPI); (2) Capa de Orquestación Agéntica (Agent Core con extracción regex de RUT y montos, y Context Manager con ventana deslizante de 5 turnos); (3) Capa de Recuperación RAG y Herramientas (Vector Store y API externa); y (4) Capa de Generación Fiel y Evaluación (Grounded Engine y RAG Coherence Evaluator).</w:t>
+        <w:t>4. Arquitectura de la Solución (IE4)</w:t>
       </w:r>
     </w:p>
     <w:p>
@@ -328,7 +405,7 @@
       <w:r>
         <w:drawing>
           <wp:inline xmlns:a="http://schemas.openxmlformats.org/drawingml/2006/main" xmlns:pic="http://schemas.openxmlformats.org/drawingml/2006/picture">
-            <wp:extent cx="3840480" cy="3258589"/>
+            <wp:extent cx="3657600" cy="3017982"/>
             <wp:docPr id="2" name="Picture 2"/>
             <wp:cNvGraphicFramePr>
               <a:graphicFrameLocks noChangeAspect="1"/>
@@ -349,7 +426,7 @@
                   <pic:spPr>
                     <a:xfrm>
                       <a:off x="0" y="0"/>
-                      <a:ext cx="3840480" cy="3258589"/>
+                      <a:ext cx="3657600" cy="3017982"/>
                     </a:xfrm>
                     <a:prstGeom prst="rect"/>
                   </pic:spPr>
@@ -371,7 +448,7 @@
           <w:color w:val="5A5A5A"/>
           <w:sz w:val="17"/>
         </w:rPr>
-        <w:t>Figura 2. Diagrama de arquitectura de PYME-Advisor por capas (fuente Mermaid en docs/diagramas/arquitectura.mmd).</w:t>
+        <w:t>Figura 2. Arquitectura por capas de PYME-Advisor (fuente editable: docs/diagramas/arquitectura.mmd).</w:t>
       </w:r>
     </w:p>
     <w:tbl>
@@ -388,7 +465,7 @@
       <w:tr>
         <w:tc>
           <w:tcPr>
-            <w:tcW w:type="dxa" w:w="3312"/>
+            <w:tcW w:type="dxa" w:w="1872"/>
             <w:shd w:fill="003399"/>
           </w:tcPr>
           <w:p>
@@ -396,15 +473,15 @@
               <w:rPr>
                 <w:b/>
                 <w:color w:val="FFFFFF"/>
-                <w:sz w:val="18"/>
+                <w:sz w:val="16"/>
               </w:rPr>
-              <w:t>Capa Arquitectónica</w:t>
+              <w:t>Módulo</w:t>
             </w:r>
           </w:p>
         </w:tc>
         <w:tc>
           <w:tcPr>
-            <w:tcW w:type="dxa" w:w="3312"/>
+            <w:tcW w:type="dxa" w:w="2736"/>
             <w:shd w:fill="003399"/>
           </w:tcPr>
           <w:p>
@@ -412,15 +489,15 @@
               <w:rPr>
                 <w:b/>
                 <w:color w:val="FFFFFF"/>
-                <w:sz w:val="18"/>
+                <w:sz w:val="16"/>
               </w:rPr>
-              <w:t>Módulos Clave Implementados</w:t>
+              <w:t>Archivo</w:t>
             </w:r>
           </w:p>
         </w:tc>
         <w:tc>
           <w:tcPr>
-            <w:tcW w:type="dxa" w:w="3312"/>
+            <w:tcW w:type="dxa" w:w="5328"/>
             <w:shd w:fill="003399"/>
           </w:tcPr>
           <w:p>
@@ -428,9 +505,9 @@
               <w:rPr>
                 <w:b/>
                 <w:color w:val="FFFFFF"/>
-                <w:sz w:val="18"/>
+                <w:sz w:val="16"/>
               </w:rPr>
-              <w:t>Rol Técnico y Justificación</w:t>
+              <w:t>Función en la arquitectura</w:t>
             </w:r>
           </w:p>
         </w:tc>
@@ -438,52 +515,52 @@
       <w:tr>
         <w:tc>
           <w:tcPr>
-            <w:tcW w:type="dxa" w:w="3312"/>
+            <w:tcW w:type="dxa" w:w="1872"/>
             <w:shd w:fill="FFFFFF"/>
           </w:tcPr>
           <w:p>
             <w:pPr>
-              <w:spacing w:before="40" w:after="40"/>
+              <w:spacing w:before="20" w:after="20"/>
             </w:pPr>
             <w:r>
               <w:rPr>
-                <w:sz w:val="17"/>
+                <w:sz w:val="16"/>
               </w:rPr>
-              <w:t>Interfaz y Presentación</w:t>
+              <w:t>Interfaz</w:t>
             </w:r>
           </w:p>
         </w:tc>
         <w:tc>
           <w:tcPr>
-            <w:tcW w:type="dxa" w:w="3312"/>
+            <w:tcW w:type="dxa" w:w="2736"/>
             <w:shd w:fill="FFFFFF"/>
           </w:tcPr>
           <w:p>
             <w:pPr>
-              <w:spacing w:before="40" w:after="40"/>
+              <w:spacing w:before="20" w:after="20"/>
             </w:pPr>
             <w:r>
               <w:rPr>
-                <w:sz w:val="17"/>
+                <w:sz w:val="16"/>
               </w:rPr>
-              <w:t>app.py (CLI) y web_server.py (FastAPI Dashboard)</w:t>
+              <w:t>app.py, web_server.py</w:t>
             </w:r>
           </w:p>
         </w:tc>
         <w:tc>
           <w:tcPr>
-            <w:tcW w:type="dxa" w:w="3312"/>
+            <w:tcW w:type="dxa" w:w="5328"/>
             <w:shd w:fill="FFFFFF"/>
           </w:tcPr>
           <w:p>
             <w:pPr>
-              <w:spacing w:before="40" w:after="40"/>
+              <w:spacing w:before="20" w:after="20"/>
             </w:pPr>
             <w:r>
               <w:rPr>
-                <w:sz w:val="17"/>
+                <w:sz w:val="16"/>
               </w:rPr>
-              <w:t>Permite la interacción de ejecutivos y la demostración interactiva en la defensa.</w:t>
+              <w:t>CLI y dashboard FastAPI con panel de auditoría (herramientas, fragmentos, guardrail).</w:t>
             </w:r>
           </w:p>
         </w:tc>
@@ -491,52 +568,52 @@
       <w:tr>
         <w:tc>
           <w:tcPr>
-            <w:tcW w:type="dxa" w:w="3312"/>
-            <w:shd w:fill="F8FAFC"/>
+            <w:tcW w:type="dxa" w:w="1872"/>
+            <w:shd w:fill="F1F5F9"/>
           </w:tcPr>
           <w:p>
             <w:pPr>
-              <w:spacing w:before="40" w:after="40"/>
+              <w:spacing w:before="20" w:after="20"/>
             </w:pPr>
             <w:r>
               <w:rPr>
-                <w:sz w:val="17"/>
+                <w:sz w:val="16"/>
               </w:rPr>
-              <w:t>Orquestación Agéntica</w:t>
+              <w:t>Orquestador</w:t>
             </w:r>
           </w:p>
         </w:tc>
         <w:tc>
           <w:tcPr>
-            <w:tcW w:type="dxa" w:w="3312"/>
-            <w:shd w:fill="F8FAFC"/>
+            <w:tcW w:type="dxa" w:w="2736"/>
+            <w:shd w:fill="F1F5F9"/>
           </w:tcPr>
           <w:p>
             <w:pPr>
-              <w:spacing w:before="40" w:after="40"/>
+              <w:spacing w:before="20" w:after="20"/>
             </w:pPr>
             <w:r>
               <w:rPr>
-                <w:sz w:val="17"/>
+                <w:sz w:val="16"/>
               </w:rPr>
-              <w:t>agent_core.py, context_manager.py, prompts.py</w:t>
+              <w:t>agent_core.py</w:t>
             </w:r>
           </w:p>
         </w:tc>
         <w:tc>
           <w:tcPr>
-            <w:tcW w:type="dxa" w:w="3312"/>
-            <w:shd w:fill="F8FAFC"/>
+            <w:tcW w:type="dxa" w:w="5328"/>
+            <w:shd w:fill="F1F5F9"/>
           </w:tcPr>
           <w:p>
             <w:pPr>
-              <w:spacing w:before="40" w:after="40"/>
+              <w:spacing w:before="20" w:after="20"/>
             </w:pPr>
             <w:r>
               <w:rPr>
-                <w:sz w:val="17"/>
+                <w:sz w:val="16"/>
               </w:rPr>
-              <w:t>Enruta intenciones, extrae RUT/UF, preserva la sesión y aplica guardrails normativos.</w:t>
+              <w:t>Extrae RUT/monto, invoca herramientas, recupera, genera y verifica la salida.</w:t>
             </w:r>
           </w:p>
         </w:tc>
@@ -544,52 +621,52 @@
       <w:tr>
         <w:tc>
           <w:tcPr>
-            <w:tcW w:type="dxa" w:w="3312"/>
+            <w:tcW w:type="dxa" w:w="1872"/>
             <w:shd w:fill="FFFFFF"/>
           </w:tcPr>
           <w:p>
             <w:pPr>
-              <w:spacing w:before="40" w:after="40"/>
+              <w:spacing w:before="20" w:after="20"/>
             </w:pPr>
             <w:r>
               <w:rPr>
-                <w:sz w:val="17"/>
+                <w:sz w:val="16"/>
               </w:rPr>
-              <w:t>Recuperación RAG</w:t>
+              <w:t>Motor de reglas</w:t>
             </w:r>
           </w:p>
         </w:tc>
         <w:tc>
           <w:tcPr>
-            <w:tcW w:type="dxa" w:w="3312"/>
+            <w:tcW w:type="dxa" w:w="2736"/>
             <w:shd w:fill="FFFFFF"/>
           </w:tcPr>
           <w:p>
             <w:pPr>
-              <w:spacing w:before="40" w:after="40"/>
+              <w:spacing w:before="20" w:after="20"/>
             </w:pPr>
             <w:r>
               <w:rPr>
-                <w:sz w:val="17"/>
+                <w:sz w:val="16"/>
               </w:rPr>
-              <w:t>document_loader.py, chunker.py, vector_store.py</w:t>
+              <w:t>policy_engine.py</w:t>
             </w:r>
           </w:p>
         </w:tc>
         <w:tc>
           <w:tcPr>
-            <w:tcW w:type="dxa" w:w="3312"/>
+            <w:tcW w:type="dxa" w:w="5328"/>
             <w:shd w:fill="FFFFFF"/>
           </w:tcPr>
           <w:p>
             <w:pPr>
-              <w:spacing w:before="40" w:after="40"/>
+              <w:spacing w:before="20" w:after="20"/>
             </w:pPr>
             <w:r>
               <w:rPr>
-                <w:sz w:val="17"/>
+                <w:sz w:val="16"/>
               </w:rPr>
-              <w:t>Segmentación jerárquica de políticas internas y recuperación top-k con similitud coseno.</w:t>
+              <w:t>Aplica los Art. 1, 3, 4, 5 y 11 y fija el estado preliminar de forma determinista.</w:t>
             </w:r>
           </w:p>
         </w:tc>
@@ -597,52 +674,264 @@
       <w:tr>
         <w:tc>
           <w:tcPr>
-            <w:tcW w:type="dxa" w:w="3312"/>
-            <w:shd w:fill="F8FAFC"/>
+            <w:tcW w:type="dxa" w:w="1872"/>
+            <w:shd w:fill="F1F5F9"/>
           </w:tcPr>
           <w:p>
             <w:pPr>
-              <w:spacing w:before="40" w:after="40"/>
+              <w:spacing w:before="20" w:after="20"/>
             </w:pPr>
             <w:r>
               <w:rPr>
-                <w:sz w:val="17"/>
+                <w:sz w:val="16"/>
               </w:rPr>
-              <w:t>Herramientas Externas</w:t>
+              <w:t>Recuperación</w:t>
             </w:r>
           </w:p>
         </w:tc>
         <w:tc>
           <w:tcPr>
-            <w:tcW w:type="dxa" w:w="3312"/>
-            <w:shd w:fill="F8FAFC"/>
+            <w:tcW w:type="dxa" w:w="2736"/>
+            <w:shd w:fill="F1F5F9"/>
           </w:tcPr>
           <w:p>
             <w:pPr>
-              <w:spacing w:before="40" w:after="40"/>
+              <w:spacing w:before="20" w:after="20"/>
             </w:pPr>
             <w:r>
               <w:rPr>
-                <w:sz w:val="17"/>
+                <w:sz w:val="16"/>
               </w:rPr>
-              <w:t>economic_indicators.py, client_lookup.py</w:t>
+              <w:t>chunker.py, vector_store.py</w:t>
             </w:r>
           </w:p>
         </w:tc>
         <w:tc>
           <w:tcPr>
-            <w:tcW w:type="dxa" w:w="3312"/>
-            <w:shd w:fill="F8FAFC"/>
+            <w:tcW w:type="dxa" w:w="5328"/>
+            <w:shd w:fill="F1F5F9"/>
           </w:tcPr>
           <w:p>
             <w:pPr>
-              <w:spacing w:before="40" w:after="40"/>
+              <w:spacing w:before="20" w:after="20"/>
             </w:pPr>
             <w:r>
               <w:rPr>
-                <w:sz w:val="17"/>
+                <w:sz w:val="16"/>
               </w:rPr>
-              <w:t>Consumo en vivo de la API de UF/Dólar y validación cruzada en la base de clientes.</w:t>
+              <w:t>Segmentación por artículo e índice TF-IDF con búsqueda multi-consulta.</w:t>
+            </w:r>
+          </w:p>
+        </w:tc>
+      </w:tr>
+      <w:tr>
+        <w:tc>
+          <w:tcPr>
+            <w:tcW w:type="dxa" w:w="1872"/>
+            <w:shd w:fill="FFFFFF"/>
+          </w:tcPr>
+          <w:p>
+            <w:pPr>
+              <w:spacing w:before="20" w:after="20"/>
+            </w:pPr>
+            <w:r>
+              <w:rPr>
+                <w:sz w:val="16"/>
+              </w:rPr>
+              <w:t>Herramientas</w:t>
+            </w:r>
+          </w:p>
+        </w:tc>
+        <w:tc>
+          <w:tcPr>
+            <w:tcW w:type="dxa" w:w="2736"/>
+            <w:shd w:fill="FFFFFF"/>
+          </w:tcPr>
+          <w:p>
+            <w:pPr>
+              <w:spacing w:before="20" w:after="20"/>
+            </w:pPr>
+            <w:r>
+              <w:rPr>
+                <w:sz w:val="16"/>
+              </w:rPr>
+              <w:t>client_lookup.py, economic_indicators.py</w:t>
+            </w:r>
+          </w:p>
+        </w:tc>
+        <w:tc>
+          <w:tcPr>
+            <w:tcW w:type="dxa" w:w="5328"/>
+            <w:shd w:fill="FFFFFF"/>
+          </w:tcPr>
+          <w:p>
+            <w:pPr>
+              <w:spacing w:before="20" w:after="20"/>
+            </w:pPr>
+            <w:r>
+              <w:rPr>
+                <w:sz w:val="16"/>
+              </w:rPr>
+              <w:t>Base interna de clientes y API de indicadores con caché y respaldo.</w:t>
+            </w:r>
+          </w:p>
+        </w:tc>
+      </w:tr>
+      <w:tr>
+        <w:tc>
+          <w:tcPr>
+            <w:tcW w:type="dxa" w:w="1872"/>
+            <w:shd w:fill="F1F5F9"/>
+          </w:tcPr>
+          <w:p>
+            <w:pPr>
+              <w:spacing w:before="20" w:after="20"/>
+            </w:pPr>
+            <w:r>
+              <w:rPr>
+                <w:sz w:val="16"/>
+              </w:rPr>
+              <w:t>Contexto</w:t>
+            </w:r>
+          </w:p>
+        </w:tc>
+        <w:tc>
+          <w:tcPr>
+            <w:tcW w:type="dxa" w:w="2736"/>
+            <w:shd w:fill="F1F5F9"/>
+          </w:tcPr>
+          <w:p>
+            <w:pPr>
+              <w:spacing w:before="20" w:after="20"/>
+            </w:pPr>
+            <w:r>
+              <w:rPr>
+                <w:sz w:val="16"/>
+              </w:rPr>
+              <w:t>context_manager.py</w:t>
+            </w:r>
+          </w:p>
+        </w:tc>
+        <w:tc>
+          <w:tcPr>
+            <w:tcW w:type="dxa" w:w="5328"/>
+            <w:shd w:fill="F1F5F9"/>
+          </w:tcPr>
+          <w:p>
+            <w:pPr>
+              <w:spacing w:before="20" w:after="20"/>
+            </w:pPr>
+            <w:r>
+              <w:rPr>
+                <w:sz w:val="16"/>
+              </w:rPr>
+              <w:t>Memoria de sesión (5 turnos) y cliente activo para preguntas de seguimiento.</w:t>
+            </w:r>
+          </w:p>
+        </w:tc>
+      </w:tr>
+      <w:tr>
+        <w:tc>
+          <w:tcPr>
+            <w:tcW w:type="dxa" w:w="1872"/>
+            <w:shd w:fill="FFFFFF"/>
+          </w:tcPr>
+          <w:p>
+            <w:pPr>
+              <w:spacing w:before="20" w:after="20"/>
+            </w:pPr>
+            <w:r>
+              <w:rPr>
+                <w:sz w:val="16"/>
+              </w:rPr>
+              <w:t>Generación</w:t>
+            </w:r>
+          </w:p>
+        </w:tc>
+        <w:tc>
+          <w:tcPr>
+            <w:tcW w:type="dxa" w:w="2736"/>
+            <w:shd w:fill="FFFFFF"/>
+          </w:tcPr>
+          <w:p>
+            <w:pPr>
+              <w:spacing w:before="20" w:after="20"/>
+            </w:pPr>
+            <w:r>
+              <w:rPr>
+                <w:sz w:val="16"/>
+              </w:rPr>
+              <w:t>prompts.py + gpt-4o-mini</w:t>
+            </w:r>
+          </w:p>
+        </w:tc>
+        <w:tc>
+          <w:tcPr>
+            <w:tcW w:type="dxa" w:w="5328"/>
+            <w:shd w:fill="FFFFFF"/>
+          </w:tcPr>
+          <w:p>
+            <w:pPr>
+              <w:spacing w:before="20" w:after="20"/>
+            </w:pPr>
+            <w:r>
+              <w:rPr>
+                <w:sz w:val="16"/>
+              </w:rPr>
+              <w:t>LLM si existe OPENAI_API_KEY; si no, motor de síntesis local que redacta sólo con artículos recuperados.</w:t>
+            </w:r>
+          </w:p>
+        </w:tc>
+      </w:tr>
+      <w:tr>
+        <w:tc>
+          <w:tcPr>
+            <w:tcW w:type="dxa" w:w="1872"/>
+            <w:shd w:fill="F1F5F9"/>
+          </w:tcPr>
+          <w:p>
+            <w:pPr>
+              <w:spacing w:before="20" w:after="20"/>
+            </w:pPr>
+            <w:r>
+              <w:rPr>
+                <w:sz w:val="16"/>
+              </w:rPr>
+              <w:t>Guardrail de salida</w:t>
+            </w:r>
+          </w:p>
+        </w:tc>
+        <w:tc>
+          <w:tcPr>
+            <w:tcW w:type="dxa" w:w="2736"/>
+            <w:shd w:fill="F1F5F9"/>
+          </w:tcPr>
+          <w:p>
+            <w:pPr>
+              <w:spacing w:before="20" w:after="20"/>
+            </w:pPr>
+            <w:r>
+              <w:rPr>
+                <w:sz w:val="16"/>
+              </w:rPr>
+              <w:t>agent_core.validate_citations</w:t>
+            </w:r>
+          </w:p>
+        </w:tc>
+        <w:tc>
+          <w:tcPr>
+            <w:tcW w:type="dxa" w:w="5328"/>
+            <w:shd w:fill="F1F5F9"/>
+          </w:tcPr>
+          <w:p>
+            <w:pPr>
+              <w:spacing w:before="20" w:after="20"/>
+            </w:pPr>
+            <w:r>
+              <w:rPr>
+                <w:sz w:val="16"/>
+              </w:rPr>
+              <w:t>Marca toda cita sin fragmento de respaldo y corrige un estado que contradiga al motor de reglas.</w:t>
             </w:r>
           </w:p>
         </w:tc>
@@ -650,8 +939,13 @@
     </w:tbl>
     <w:p>
       <w:pPr>
+        <w:spacing w:after="0"/>
+      </w:pPr>
+    </w:p>
+    <w:p>
+      <w:pPr>
         <w:pStyle w:val="Heading1"/>
-        <w:spacing w:before="200" w:after="80"/>
+        <w:spacing w:before="160" w:after="60"/>
       </w:pPr>
       <w:r>
         <w:rPr>
@@ -659,15 +953,19 @@
           <w:color w:val="003399"/>
           <w:sz w:val="24"/>
         </w:rPr>
-        <w:t>5. Evaluación de Coherencia, Resultados y Justificación Técnica (IE5, IE6, IE8)</w:t>
+        <w:t>5. Evaluación, Decisiones de Diseño y Resultados (IE5)</w:t>
       </w:r>
     </w:p>
     <w:p>
       <w:pPr>
-        <w:spacing w:after="80"/>
+        <w:spacing w:after="60"/>
+        <w:jc w:val="both"/>
       </w:pPr>
       <w:r>
-        <w:t>Para evaluar la credibilidad técnica de la solución (IE6), se ejecutó una batería automatizada de pruebas sobre cinco casos canónicos organizacionales:</w:t>
+        <w:rPr>
+          <w:b w:val="0"/>
+        </w:rPr>
+        <w:t>La batería src/evaluation/evaluate_coherence.py ejecuta 7 casos con resultado esperado conocido y mide la coherencia entre los datos recuperados y la respuesta:</w:t>
       </w:r>
     </w:p>
     <w:tbl>
@@ -677,16 +975,15 @@
         <w:tblLook w:firstColumn="1" w:firstRow="1" w:lastColumn="0" w:lastRow="0" w:noHBand="0" w:noVBand="1" w:val="04A0"/>
       </w:tblPr>
       <w:tblGrid>
-        <w:gridCol w:w="1987"/>
-        <w:gridCol w:w="1987"/>
-        <w:gridCol w:w="1987"/>
-        <w:gridCol w:w="1987"/>
-        <w:gridCol w:w="1987"/>
+        <w:gridCol w:w="2484"/>
+        <w:gridCol w:w="2484"/>
+        <w:gridCol w:w="2484"/>
+        <w:gridCol w:w="2484"/>
       </w:tblGrid>
       <w:tr>
         <w:tc>
           <w:tcPr>
-            <w:tcW w:type="dxa" w:w="1987"/>
+            <w:tcW w:type="dxa" w:w="3744"/>
             <w:shd w:fill="003399"/>
           </w:tcPr>
           <w:p>
@@ -694,15 +991,15 @@
               <w:rPr>
                 <w:b/>
                 <w:color w:val="FFFFFF"/>
-                <w:sz w:val="17"/>
+                <w:sz w:val="16"/>
               </w:rPr>
-              <w:t>Caso Evaluado</w:t>
+              <w:t>Caso</w:t>
             </w:r>
           </w:p>
         </w:tc>
         <w:tc>
           <w:tcPr>
-            <w:tcW w:type="dxa" w:w="1987"/>
+            <w:tcW w:type="dxa" w:w="2016"/>
             <w:shd w:fill="003399"/>
           </w:tcPr>
           <w:p>
@@ -710,15 +1007,15 @@
               <w:rPr>
                 <w:b/>
                 <w:color w:val="FFFFFF"/>
-                <w:sz w:val="17"/>
+                <w:sz w:val="16"/>
               </w:rPr>
-              <w:t>Consulta / RUT</w:t>
+              <w:t>Esperado = Obtenido</w:t>
             </w:r>
           </w:p>
         </w:tc>
         <w:tc>
           <w:tcPr>
-            <w:tcW w:type="dxa" w:w="1987"/>
+            <w:tcW w:type="dxa" w:w="2736"/>
             <w:shd w:fill="003399"/>
           </w:tcPr>
           <w:p>
@@ -726,15 +1023,15 @@
               <w:rPr>
                 <w:b/>
                 <w:color w:val="FFFFFF"/>
-                <w:sz w:val="17"/>
+                <w:sz w:val="16"/>
               </w:rPr>
-              <w:t>Dictamen Esperado / Obtenido</w:t>
+              <w:t>Artículos requeridos (recuperados)</w:t>
             </w:r>
           </w:p>
         </w:tc>
         <w:tc>
           <w:tcPr>
-            <w:tcW w:type="dxa" w:w="1987"/>
+            <w:tcW w:type="dxa" w:w="1440"/>
             <w:shd w:fill="003399"/>
           </w:tcPr>
           <w:p>
@@ -742,15 +1039,542 @@
               <w:rPr>
                 <w:b/>
                 <w:color w:val="FFFFFF"/>
-                <w:sz w:val="17"/>
+                <w:sz w:val="16"/>
               </w:rPr>
-              <w:t>Artículos Citados</w:t>
+              <w:t>Citas respaldadas</w:t>
+            </w:r>
+          </w:p>
+        </w:tc>
+      </w:tr>
+      <w:tr>
+        <w:tc>
+          <w:tcPr>
+            <w:tcW w:type="dxa" w:w="3744"/>
+            <w:shd w:fill="FFFFFF"/>
+          </w:tcPr>
+          <w:p>
+            <w:pPr>
+              <w:spacing w:before="20" w:after="20"/>
+            </w:pPr>
+            <w:r>
+              <w:rPr>
+                <w:sz w:val="16"/>
+              </w:rPr>
+              <w:t>1. Transportes Biobío, leasing 1.500 UF</w:t>
             </w:r>
           </w:p>
         </w:tc>
         <w:tc>
           <w:tcPr>
-            <w:tcW w:type="dxa" w:w="1987"/>
+            <w:tcW w:type="dxa" w:w="2016"/>
+            <w:shd w:fill="FFFFFF"/>
+          </w:tcPr>
+          <w:p>
+            <w:pPr>
+              <w:spacing w:before="20" w:after="20"/>
+            </w:pPr>
+            <w:r>
+              <w:rPr>
+                <w:sz w:val="16"/>
+              </w:rPr>
+              <w:t>PRE-ADMISIBLE</w:t>
+            </w:r>
+          </w:p>
+        </w:tc>
+        <w:tc>
+          <w:tcPr>
+            <w:tcW w:type="dxa" w:w="2736"/>
+            <w:shd w:fill="FFFFFF"/>
+          </w:tcPr>
+          <w:p>
+            <w:pPr>
+              <w:spacing w:before="20" w:after="20"/>
+            </w:pPr>
+            <w:r>
+              <w:rPr>
+                <w:sz w:val="16"/>
+              </w:rPr>
+              <w:t>3, 4, 5, 6, 9 (100%)</w:t>
+            </w:r>
+          </w:p>
+        </w:tc>
+        <w:tc>
+          <w:tcPr>
+            <w:tcW w:type="dxa" w:w="1440"/>
+            <w:shd w:fill="FFFFFF"/>
+          </w:tcPr>
+          <w:p>
+            <w:pPr>
+              <w:spacing w:before="20" w:after="20"/>
+            </w:pPr>
+            <w:r>
+              <w:rPr>
+                <w:sz w:val="16"/>
+              </w:rPr>
+              <w:t>100%</w:t>
+            </w:r>
+          </w:p>
+        </w:tc>
+      </w:tr>
+      <w:tr>
+        <w:tc>
+          <w:tcPr>
+            <w:tcW w:type="dxa" w:w="3744"/>
+            <w:shd w:fill="F1F5F9"/>
+          </w:tcPr>
+          <w:p>
+            <w:pPr>
+              <w:spacing w:before="20" w:after="20"/>
+            </w:pPr>
+            <w:r>
+              <w:rPr>
+                <w:sz w:val="16"/>
+              </w:rPr>
+              <w:t>2. Panadería El Trigal, 800 UF, DICOM $1,25 M</w:t>
+            </w:r>
+          </w:p>
+        </w:tc>
+        <w:tc>
+          <w:tcPr>
+            <w:tcW w:type="dxa" w:w="2016"/>
+            <w:shd w:fill="F1F5F9"/>
+          </w:tcPr>
+          <w:p>
+            <w:pPr>
+              <w:spacing w:before="20" w:after="20"/>
+            </w:pPr>
+            <w:r>
+              <w:rPr>
+                <w:sz w:val="16"/>
+              </w:rPr>
+              <w:t>NO ADMISIBLE</w:t>
+            </w:r>
+          </w:p>
+        </w:tc>
+        <w:tc>
+          <w:tcPr>
+            <w:tcW w:type="dxa" w:w="2736"/>
+            <w:shd w:fill="F1F5F9"/>
+          </w:tcPr>
+          <w:p>
+            <w:pPr>
+              <w:spacing w:before="20" w:after="20"/>
+            </w:pPr>
+            <w:r>
+              <w:rPr>
+                <w:sz w:val="16"/>
+              </w:rPr>
+              <w:t>4 (100%)</w:t>
+            </w:r>
+          </w:p>
+        </w:tc>
+        <w:tc>
+          <w:tcPr>
+            <w:tcW w:type="dxa" w:w="1440"/>
+            <w:shd w:fill="F1F5F9"/>
+          </w:tcPr>
+          <w:p>
+            <w:pPr>
+              <w:spacing w:before="20" w:after="20"/>
+            </w:pPr>
+            <w:r>
+              <w:rPr>
+                <w:sz w:val="16"/>
+              </w:rPr>
+              <w:t>100%</w:t>
+            </w:r>
+          </w:p>
+        </w:tc>
+      </w:tr>
+      <w:tr>
+        <w:tc>
+          <w:tcPr>
+            <w:tcW w:type="dxa" w:w="3744"/>
+            <w:shd w:fill="FFFFFF"/>
+          </w:tcPr>
+          <w:p>
+            <w:pPr>
+              <w:spacing w:before="20" w:after="20"/>
+            </w:pPr>
+            <w:r>
+              <w:rPr>
+                <w:sz w:val="16"/>
+              </w:rPr>
+              <w:t>3. Constructora del Sur, leverage 3,4x, DSCR 1,1</w:t>
+            </w:r>
+          </w:p>
+        </w:tc>
+        <w:tc>
+          <w:tcPr>
+            <w:tcW w:type="dxa" w:w="2016"/>
+            <w:shd w:fill="FFFFFF"/>
+          </w:tcPr>
+          <w:p>
+            <w:pPr>
+              <w:spacing w:before="20" w:after="20"/>
+            </w:pPr>
+            <w:r>
+              <w:rPr>
+                <w:sz w:val="16"/>
+              </w:rPr>
+              <w:t>COMITÉ</w:t>
+            </w:r>
+          </w:p>
+        </w:tc>
+        <w:tc>
+          <w:tcPr>
+            <w:tcW w:type="dxa" w:w="2736"/>
+            <w:shd w:fill="FFFFFF"/>
+          </w:tcPr>
+          <w:p>
+            <w:pPr>
+              <w:spacing w:before="20" w:after="20"/>
+            </w:pPr>
+            <w:r>
+              <w:rPr>
+                <w:sz w:val="16"/>
+              </w:rPr>
+              <w:t>5, 11 (100%)</w:t>
+            </w:r>
+          </w:p>
+        </w:tc>
+        <w:tc>
+          <w:tcPr>
+            <w:tcW w:type="dxa" w:w="1440"/>
+            <w:shd w:fill="FFFFFF"/>
+          </w:tcPr>
+          <w:p>
+            <w:pPr>
+              <w:spacing w:before="20" w:after="20"/>
+            </w:pPr>
+            <w:r>
+              <w:rPr>
+                <w:sz w:val="16"/>
+              </w:rPr>
+              <w:t>100%</w:t>
+            </w:r>
+          </w:p>
+        </w:tc>
+      </w:tr>
+      <w:tr>
+        <w:tc>
+          <w:tcPr>
+            <w:tcW w:type="dxa" w:w="3744"/>
+            <w:shd w:fill="F1F5F9"/>
+          </w:tcPr>
+          <w:p>
+            <w:pPr>
+              <w:spacing w:before="20" w:after="20"/>
+            </w:pPr>
+            <w:r>
+              <w:rPr>
+                <w:sz w:val="16"/>
+              </w:rPr>
+              <w:t>4. Frutícola Express, 5 meses</w:t>
+            </w:r>
+          </w:p>
+        </w:tc>
+        <w:tc>
+          <w:tcPr>
+            <w:tcW w:type="dxa" w:w="2016"/>
+            <w:shd w:fill="F1F5F9"/>
+          </w:tcPr>
+          <w:p>
+            <w:pPr>
+              <w:spacing w:before="20" w:after="20"/>
+            </w:pPr>
+            <w:r>
+              <w:rPr>
+                <w:sz w:val="16"/>
+              </w:rPr>
+              <w:t>NO ADMISIBLE</w:t>
+            </w:r>
+          </w:p>
+        </w:tc>
+        <w:tc>
+          <w:tcPr>
+            <w:tcW w:type="dxa" w:w="2736"/>
+            <w:shd w:fill="F1F5F9"/>
+          </w:tcPr>
+          <w:p>
+            <w:pPr>
+              <w:spacing w:before="20" w:after="20"/>
+            </w:pPr>
+            <w:r>
+              <w:rPr>
+                <w:sz w:val="16"/>
+              </w:rPr>
+              <w:t>3 (100%)</w:t>
+            </w:r>
+          </w:p>
+        </w:tc>
+        <w:tc>
+          <w:tcPr>
+            <w:tcW w:type="dxa" w:w="1440"/>
+            <w:shd w:fill="F1F5F9"/>
+          </w:tcPr>
+          <w:p>
+            <w:pPr>
+              <w:spacing w:before="20" w:after="20"/>
+            </w:pPr>
+            <w:r>
+              <w:rPr>
+                <w:sz w:val="16"/>
+              </w:rPr>
+              <w:t>100%</w:t>
+            </w:r>
+          </w:p>
+        </w:tc>
+      </w:tr>
+      <w:tr>
+        <w:tc>
+          <w:tcPr>
+            <w:tcW w:type="dxa" w:w="3744"/>
+            <w:shd w:fill="FFFFFF"/>
+          </w:tcPr>
+          <w:p>
+            <w:pPr>
+              <w:spacing w:before="20" w:after="20"/>
+            </w:pPr>
+            <w:r>
+              <w:rPr>
+                <w:sz w:val="16"/>
+              </w:rPr>
+              <w:t>5. TecnoAgro, capital de trabajo 600 UF</w:t>
+            </w:r>
+          </w:p>
+        </w:tc>
+        <w:tc>
+          <w:tcPr>
+            <w:tcW w:type="dxa" w:w="2016"/>
+            <w:shd w:fill="FFFFFF"/>
+          </w:tcPr>
+          <w:p>
+            <w:pPr>
+              <w:spacing w:before="20" w:after="20"/>
+            </w:pPr>
+            <w:r>
+              <w:rPr>
+                <w:sz w:val="16"/>
+              </w:rPr>
+              <w:t>PRE-ADMISIBLE</w:t>
+            </w:r>
+          </w:p>
+        </w:tc>
+        <w:tc>
+          <w:tcPr>
+            <w:tcW w:type="dxa" w:w="2736"/>
+            <w:shd w:fill="FFFFFF"/>
+          </w:tcPr>
+          <w:p>
+            <w:pPr>
+              <w:spacing w:before="20" w:after="20"/>
+            </w:pPr>
+            <w:r>
+              <w:rPr>
+                <w:sz w:val="16"/>
+              </w:rPr>
+              <w:t>3, 4, 5, 6, 8 (100%)</w:t>
+            </w:r>
+          </w:p>
+        </w:tc>
+        <w:tc>
+          <w:tcPr>
+            <w:tcW w:type="dxa" w:w="1440"/>
+            <w:shd w:fill="FFFFFF"/>
+          </w:tcPr>
+          <w:p>
+            <w:pPr>
+              <w:spacing w:before="20" w:after="20"/>
+            </w:pPr>
+            <w:r>
+              <w:rPr>
+                <w:sz w:val="16"/>
+              </w:rPr>
+              <w:t>100%</w:t>
+            </w:r>
+          </w:p>
+        </w:tc>
+      </w:tr>
+      <w:tr>
+        <w:tc>
+          <w:tcPr>
+            <w:tcW w:type="dxa" w:w="3744"/>
+            <w:shd w:fill="F1F5F9"/>
+          </w:tcPr>
+          <w:p>
+            <w:pPr>
+              <w:spacing w:before="20" w:after="20"/>
+            </w:pPr>
+            <w:r>
+              <w:rPr>
+                <w:sz w:val="16"/>
+              </w:rPr>
+              <w:t>6. TecnoAgro, 12.000 UF</w:t>
+            </w:r>
+          </w:p>
+        </w:tc>
+        <w:tc>
+          <w:tcPr>
+            <w:tcW w:type="dxa" w:w="2016"/>
+            <w:shd w:fill="F1F5F9"/>
+          </w:tcPr>
+          <w:p>
+            <w:pPr>
+              <w:spacing w:before="20" w:after="20"/>
+            </w:pPr>
+            <w:r>
+              <w:rPr>
+                <w:sz w:val="16"/>
+              </w:rPr>
+              <w:t>COMITÉ</w:t>
+            </w:r>
+          </w:p>
+        </w:tc>
+        <w:tc>
+          <w:tcPr>
+            <w:tcW w:type="dxa" w:w="2736"/>
+            <w:shd w:fill="F1F5F9"/>
+          </w:tcPr>
+          <w:p>
+            <w:pPr>
+              <w:spacing w:before="20" w:after="20"/>
+            </w:pPr>
+            <w:r>
+              <w:rPr>
+                <w:sz w:val="16"/>
+              </w:rPr>
+              <w:t>11 (100%)</w:t>
+            </w:r>
+          </w:p>
+        </w:tc>
+        <w:tc>
+          <w:tcPr>
+            <w:tcW w:type="dxa" w:w="1440"/>
+            <w:shd w:fill="F1F5F9"/>
+          </w:tcPr>
+          <w:p>
+            <w:pPr>
+              <w:spacing w:before="20" w:after="20"/>
+            </w:pPr>
+            <w:r>
+              <w:rPr>
+                <w:sz w:val="16"/>
+              </w:rPr>
+              <w:t>100%</w:t>
+            </w:r>
+          </w:p>
+        </w:tc>
+      </w:tr>
+      <w:tr>
+        <w:tc>
+          <w:tcPr>
+            <w:tcW w:type="dxa" w:w="3744"/>
+            <w:shd w:fill="FFFFFF"/>
+          </w:tcPr>
+          <w:p>
+            <w:pPr>
+              <w:spacing w:before="20" w:after="20"/>
+            </w:pPr>
+            <w:r>
+              <w:rPr>
+                <w:sz w:val="16"/>
+              </w:rPr>
+              <w:t>7. Consulta general FOGAPE</w:t>
+            </w:r>
+          </w:p>
+        </w:tc>
+        <w:tc>
+          <w:tcPr>
+            <w:tcW w:type="dxa" w:w="2016"/>
+            <w:shd w:fill="FFFFFF"/>
+          </w:tcPr>
+          <w:p>
+            <w:pPr>
+              <w:spacing w:before="20" w:after="20"/>
+            </w:pPr>
+            <w:r>
+              <w:rPr>
+                <w:sz w:val="16"/>
+              </w:rPr>
+              <w:t>INFORMACIÓN GENERAL</w:t>
+            </w:r>
+          </w:p>
+        </w:tc>
+        <w:tc>
+          <w:tcPr>
+            <w:tcW w:type="dxa" w:w="2736"/>
+            <w:shd w:fill="FFFFFF"/>
+          </w:tcPr>
+          <w:p>
+            <w:pPr>
+              <w:spacing w:before="20" w:after="20"/>
+            </w:pPr>
+            <w:r>
+              <w:rPr>
+                <w:sz w:val="16"/>
+              </w:rPr>
+              <w:t>6 (100%)</w:t>
+            </w:r>
+          </w:p>
+        </w:tc>
+        <w:tc>
+          <w:tcPr>
+            <w:tcW w:type="dxa" w:w="1440"/>
+            <w:shd w:fill="FFFFFF"/>
+          </w:tcPr>
+          <w:p>
+            <w:pPr>
+              <w:spacing w:before="20" w:after="20"/>
+            </w:pPr>
+            <w:r>
+              <w:rPr>
+                <w:sz w:val="16"/>
+              </w:rPr>
+              <w:t>100%</w:t>
+            </w:r>
+          </w:p>
+        </w:tc>
+      </w:tr>
+    </w:tbl>
+    <w:p>
+      <w:pPr>
+        <w:spacing w:after="0"/>
+      </w:pPr>
+    </w:p>
+    <w:p>
+      <w:pPr>
+        <w:spacing w:after="80"/>
+        <w:jc w:val="both"/>
+      </w:pPr>
+      <w:r>
+        <w:rPr>
+          <w:b/>
+        </w:rPr>
+        <w:t xml:space="preserve">Resultados: </w:t>
+      </w:r>
+      <w:r>
+        <w:rPr>
+          <w:b w:val="0"/>
+        </w:rPr>
+        <w:t>precisión de dictamen 100%; recall de recuperación 100% frente a 17,1% de la línea base que busca sólo con la consulta original (top-3); groundedness de citas 100%; consistencia UF→CLP 100%; latencia bajo 0,3 s por consulta. Además, 17 pruebas unitarias (unittest) aprobadas. Logs y capturas en docs/evidencias.</w:t>
+      </w:r>
+    </w:p>
+    <w:tbl>
+      <w:tblPr>
+        <w:tblW w:type="auto" w:w="0"/>
+        <w:jc w:val="center"/>
+        <w:tblLook w:firstColumn="1" w:firstRow="1" w:lastColumn="0" w:lastRow="0" w:noHBand="0" w:noVBand="1" w:val="04A0"/>
+      </w:tblPr>
+      <w:tblGrid>
+        <w:gridCol w:w="3312"/>
+        <w:gridCol w:w="3312"/>
+        <w:gridCol w:w="3312"/>
+      </w:tblGrid>
+      <w:tr>
+        <w:tc>
+          <w:tcPr>
+            <w:tcW w:type="dxa" w:w="2304"/>
             <w:shd w:fill="003399"/>
           </w:tcPr>
           <w:p>
@@ -758,9 +1582,41 @@
               <w:rPr>
                 <w:b/>
                 <w:color w:val="FFFFFF"/>
-                <w:sz w:val="17"/>
+                <w:sz w:val="16"/>
               </w:rPr>
-              <w:t>Fidelidad (Groundedness)</w:t>
+              <w:t>Decisión</w:t>
+            </w:r>
+          </w:p>
+        </w:tc>
+        <w:tc>
+          <w:tcPr>
+            <w:tcW w:type="dxa" w:w="2304"/>
+            <w:shd w:fill="003399"/>
+          </w:tcPr>
+          <w:p>
+            <w:r>
+              <w:rPr>
+                <w:b/>
+                <w:color w:val="FFFFFF"/>
+                <w:sz w:val="16"/>
+              </w:rPr>
+              <w:t>Alternativa descartada</w:t>
+            </w:r>
+          </w:p>
+        </w:tc>
+        <w:tc>
+          <w:tcPr>
+            <w:tcW w:type="dxa" w:w="5328"/>
+            <w:shd w:fill="003399"/>
+          </w:tcPr>
+          <w:p>
+            <w:r>
+              <w:rPr>
+                <w:b/>
+                <w:color w:val="FFFFFF"/>
+                <w:sz w:val="16"/>
+              </w:rPr>
+              <w:t>Justificación</w:t>
             </w:r>
           </w:p>
         </w:tc>
@@ -768,86 +1624,52 @@
       <w:tr>
         <w:tc>
           <w:tcPr>
-            <w:tcW w:type="dxa" w:w="1987"/>
+            <w:tcW w:type="dxa" w:w="2304"/>
             <w:shd w:fill="FFFFFF"/>
           </w:tcPr>
           <w:p>
             <w:pPr>
-              <w:spacing w:before="40" w:after="40"/>
+              <w:spacing w:before="20" w:after="20"/>
             </w:pPr>
             <w:r>
               <w:rPr>
                 <w:sz w:val="16"/>
               </w:rPr>
-              <w:t>1. Transportes Biobío</w:t>
+              <w:t>Motor de reglas + LLM</w:t>
             </w:r>
           </w:p>
         </w:tc>
         <w:tc>
           <w:tcPr>
-            <w:tcW w:type="dxa" w:w="1987"/>
+            <w:tcW w:type="dxa" w:w="2304"/>
             <w:shd w:fill="FFFFFF"/>
           </w:tcPr>
           <w:p>
             <w:pPr>
-              <w:spacing w:before="40" w:after="40"/>
+              <w:spacing w:before="20" w:after="20"/>
             </w:pPr>
             <w:r>
               <w:rPr>
                 <w:sz w:val="16"/>
               </w:rPr>
-              <w:t>1.500 UF camión (RUT 76.123.456-K)</w:t>
+              <w:t>Que el LLM decida el estado</w:t>
             </w:r>
           </w:p>
         </w:tc>
         <w:tc>
           <w:tcPr>
-            <w:tcW w:type="dxa" w:w="1987"/>
+            <w:tcW w:type="dxa" w:w="5328"/>
             <w:shd w:fill="FFFFFF"/>
           </w:tcPr>
           <w:p>
             <w:pPr>
-              <w:spacing w:before="40" w:after="40"/>
+              <w:spacing w:before="20" w:after="20"/>
             </w:pPr>
             <w:r>
               <w:rPr>
                 <w:sz w:val="16"/>
               </w:rPr>
-              <w:t>Pre-Admisible / Leasing</w:t>
-            </w:r>
-          </w:p>
-        </w:tc>
-        <w:tc>
-          <w:tcPr>
-            <w:tcW w:type="dxa" w:w="1987"/>
-            <w:shd w:fill="FFFFFF"/>
-          </w:tcPr>
-          <w:p>
-            <w:pPr>
-              <w:spacing w:before="40" w:after="40"/>
-            </w:pPr>
-            <w:r>
-              <w:rPr>
-                <w:sz w:val="16"/>
-              </w:rPr>
-              <w:t>Art. 3, Art. 4, Art. 6 (FOGAPE 85%)</w:t>
-            </w:r>
-          </w:p>
-        </w:tc>
-        <w:tc>
-          <w:tcPr>
-            <w:tcW w:type="dxa" w:w="1987"/>
-            <w:shd w:fill="FFFFFF"/>
-          </w:tcPr>
-          <w:p>
-            <w:pPr>
-              <w:spacing w:before="40" w:after="40"/>
-            </w:pPr>
-            <w:r>
-              <w:rPr>
-                <w:sz w:val="16"/>
-              </w:rPr>
-              <w:t>100,0%</w:t>
+              <w:t>La decisión crediticia debe ser auditable y reproducible; el LLM explica y el motor decide.</w:t>
             </w:r>
           </w:p>
         </w:tc>
@@ -855,86 +1677,52 @@
       <w:tr>
         <w:tc>
           <w:tcPr>
-            <w:tcW w:type="dxa" w:w="1987"/>
-            <w:shd w:fill="F8FAFC"/>
+            <w:tcW w:type="dxa" w:w="2304"/>
+            <w:shd w:fill="F1F5F9"/>
           </w:tcPr>
           <w:p>
             <w:pPr>
-              <w:spacing w:before="40" w:after="40"/>
+              <w:spacing w:before="20" w:after="20"/>
             </w:pPr>
             <w:r>
               <w:rPr>
                 <w:sz w:val="16"/>
               </w:rPr>
-              <w:t>2. Panadería El Trigal</w:t>
+              <w:t>Descomposición en sub-consultas</w:t>
             </w:r>
           </w:p>
         </w:tc>
         <w:tc>
           <w:tcPr>
-            <w:tcW w:type="dxa" w:w="1987"/>
-            <w:shd w:fill="F8FAFC"/>
+            <w:tcW w:type="dxa" w:w="2304"/>
+            <w:shd w:fill="F1F5F9"/>
           </w:tcPr>
           <w:p>
             <w:pPr>
-              <w:spacing w:before="40" w:after="40"/>
+              <w:spacing w:before="20" w:after="20"/>
             </w:pPr>
             <w:r>
               <w:rPr>
                 <w:sz w:val="16"/>
               </w:rPr>
-              <w:t>800 UF Capital (RUT 76.999.888-4)</w:t>
+              <w:t>Búsqueda única top-k</w:t>
             </w:r>
           </w:p>
         </w:tc>
         <w:tc>
           <w:tcPr>
-            <w:tcW w:type="dxa" w:w="1987"/>
-            <w:shd w:fill="F8FAFC"/>
+            <w:tcW w:type="dxa" w:w="5328"/>
+            <w:shd w:fill="F1F5F9"/>
           </w:tcPr>
           <w:p>
             <w:pPr>
-              <w:spacing w:before="40" w:after="40"/>
+              <w:spacing w:before="20" w:after="20"/>
             </w:pPr>
             <w:r>
               <w:rPr>
                 <w:sz w:val="16"/>
               </w:rPr>
-              <w:t>No Admisible (DICOM &gt; $500k)</w:t>
-            </w:r>
-          </w:p>
-        </w:tc>
-        <w:tc>
-          <w:tcPr>
-            <w:tcW w:type="dxa" w:w="1987"/>
-            <w:shd w:fill="F8FAFC"/>
-          </w:tcPr>
-          <w:p>
-            <w:pPr>
-              <w:spacing w:before="40" w:after="40"/>
-            </w:pPr>
-            <w:r>
-              <w:rPr>
-                <w:sz w:val="16"/>
-              </w:rPr>
-              <w:t>Art. 4 (Morosidad activa)</w:t>
-            </w:r>
-          </w:p>
-        </w:tc>
-        <w:tc>
-          <w:tcPr>
-            <w:tcW w:type="dxa" w:w="1987"/>
-            <w:shd w:fill="F8FAFC"/>
-          </w:tcPr>
-          <w:p>
-            <w:pPr>
-              <w:spacing w:before="40" w:after="40"/>
-            </w:pPr>
-            <w:r>
-              <w:rPr>
-                <w:sz w:val="16"/>
-              </w:rPr>
-              <w:t>100,0%</w:t>
+              <w:t>Una consulta cubre varias reglas; medido: recall 17,1% → 100%.</w:t>
             </w:r>
           </w:p>
         </w:tc>
@@ -942,86 +1730,52 @@
       <w:tr>
         <w:tc>
           <w:tcPr>
-            <w:tcW w:type="dxa" w:w="1987"/>
+            <w:tcW w:type="dxa" w:w="2304"/>
             <w:shd w:fill="FFFFFF"/>
           </w:tcPr>
           <w:p>
             <w:pPr>
-              <w:spacing w:before="40" w:after="40"/>
+              <w:spacing w:before="20" w:after="20"/>
             </w:pPr>
             <w:r>
               <w:rPr>
                 <w:sz w:val="16"/>
               </w:rPr>
-              <w:t>3. Constructora del Sur</w:t>
+              <w:t>TF-IDF 1–3 gramas</w:t>
             </w:r>
           </w:p>
         </w:tc>
         <w:tc>
           <w:tcPr>
-            <w:tcW w:type="dxa" w:w="1987"/>
+            <w:tcW w:type="dxa" w:w="2304"/>
             <w:shd w:fill="FFFFFF"/>
           </w:tcPr>
           <w:p>
             <w:pPr>
-              <w:spacing w:before="40" w:after="40"/>
+              <w:spacing w:before="20" w:after="20"/>
             </w:pPr>
             <w:r>
               <w:rPr>
                 <w:sz w:val="16"/>
               </w:rPr>
-              <w:t>4.000 UF Línea (RUT 76.543.210-8)</w:t>
+              <w:t>Embeddings densos</w:t>
             </w:r>
           </w:p>
         </w:tc>
         <w:tc>
           <w:tcPr>
-            <w:tcW w:type="dxa" w:w="1987"/>
+            <w:tcW w:type="dxa" w:w="5328"/>
             <w:shd w:fill="FFFFFF"/>
           </w:tcPr>
           <w:p>
             <w:pPr>
-              <w:spacing w:before="40" w:after="40"/>
+              <w:spacing w:before="20" w:after="20"/>
             </w:pPr>
             <w:r>
               <w:rPr>
                 <w:sz w:val="16"/>
               </w:rPr>
-              <w:t>Derivación Comité Especial</w:t>
-            </w:r>
-          </w:p>
-        </w:tc>
-        <w:tc>
-          <w:tcPr>
-            <w:tcW w:type="dxa" w:w="1987"/>
-            <w:shd w:fill="FFFFFF"/>
-          </w:tcPr>
-          <w:p>
-            <w:pPr>
-              <w:spacing w:before="40" w:after="40"/>
-            </w:pPr>
-            <w:r>
-              <w:rPr>
-                <w:sz w:val="16"/>
-              </w:rPr>
-              <w:t>Art. 5, Art. 11 (Leverage &gt; 3.2x)</w:t>
-            </w:r>
-          </w:p>
-        </w:tc>
-        <w:tc>
-          <w:tcPr>
-            <w:tcW w:type="dxa" w:w="1987"/>
-            <w:shd w:fill="FFFFFF"/>
-          </w:tcPr>
-          <w:p>
-            <w:pPr>
-              <w:spacing w:before="40" w:after="40"/>
-            </w:pPr>
-            <w:r>
-              <w:rPr>
-                <w:sz w:val="16"/>
-              </w:rPr>
-              <w:t>100,0%</w:t>
+              <w:t>Corpus pequeño y terminología exacta (DICOM, FOGAPE, UF); sin costo ni dependencia externa. Se revisará si crece el corpus.</w:t>
             </w:r>
           </w:p>
         </w:tc>
@@ -1029,86 +1783,52 @@
       <w:tr>
         <w:tc>
           <w:tcPr>
-            <w:tcW w:type="dxa" w:w="1987"/>
-            <w:shd w:fill="F8FAFC"/>
+            <w:tcW w:type="dxa" w:w="2304"/>
+            <w:shd w:fill="F1F5F9"/>
           </w:tcPr>
           <w:p>
             <w:pPr>
-              <w:spacing w:before="40" w:after="40"/>
+              <w:spacing w:before="20" w:after="20"/>
             </w:pPr>
             <w:r>
               <w:rPr>
                 <w:sz w:val="16"/>
               </w:rPr>
-              <w:t>4. Frutícola Express</w:t>
+              <w:t>Chunking por artículo</w:t>
             </w:r>
           </w:p>
         </w:tc>
         <w:tc>
           <w:tcPr>
-            <w:tcW w:type="dxa" w:w="1987"/>
-            <w:shd w:fill="F8FAFC"/>
+            <w:tcW w:type="dxa" w:w="2304"/>
+            <w:shd w:fill="F1F5F9"/>
           </w:tcPr>
           <w:p>
             <w:pPr>
-              <w:spacing w:before="40" w:after="40"/>
+              <w:spacing w:before="20" w:after="20"/>
             </w:pPr>
             <w:r>
               <w:rPr>
                 <w:sz w:val="16"/>
               </w:rPr>
-              <w:t>500 UF Capital (RUT 78.111.222-1)</w:t>
+              <w:t>Ventanas fijas de caracteres</w:t>
             </w:r>
           </w:p>
         </w:tc>
         <w:tc>
           <w:tcPr>
-            <w:tcW w:type="dxa" w:w="1987"/>
-            <w:shd w:fill="F8FAFC"/>
+            <w:tcW w:type="dxa" w:w="5328"/>
+            <w:shd w:fill="F1F5F9"/>
           </w:tcPr>
           <w:p>
             <w:pPr>
-              <w:spacing w:before="40" w:after="40"/>
+              <w:spacing w:before="20" w:after="20"/>
             </w:pPr>
             <w:r>
               <w:rPr>
                 <w:sz w:val="16"/>
               </w:rPr>
-              <w:t>No Admisible (Antigüedad &lt; 12m)</w:t>
-            </w:r>
-          </w:p>
-        </w:tc>
-        <w:tc>
-          <w:tcPr>
-            <w:tcW w:type="dxa" w:w="1987"/>
-            <w:shd w:fill="F8FAFC"/>
-          </w:tcPr>
-          <w:p>
-            <w:pPr>
-              <w:spacing w:before="40" w:after="40"/>
-            </w:pPr>
-            <w:r>
-              <w:rPr>
-                <w:sz w:val="16"/>
-              </w:rPr>
-              <w:t>Art. 3 (Iniciación en SII)</w:t>
-            </w:r>
-          </w:p>
-        </w:tc>
-        <w:tc>
-          <w:tcPr>
-            <w:tcW w:type="dxa" w:w="1987"/>
-            <w:shd w:fill="F8FAFC"/>
-          </w:tcPr>
-          <w:p>
-            <w:pPr>
-              <w:spacing w:before="40" w:after="40"/>
-            </w:pPr>
-            <w:r>
-              <w:rPr>
-                <w:sz w:val="16"/>
-              </w:rPr>
-              <w:t>100,0%</w:t>
+              <w:t>Una regla y su excepción quedan en el mismo fragmento y la cita al artículo es inequívoca.</w:t>
             </w:r>
           </w:p>
         </w:tc>
@@ -1116,86 +1836,105 @@
       <w:tr>
         <w:tc>
           <w:tcPr>
-            <w:tcW w:type="dxa" w:w="1987"/>
+            <w:tcW w:type="dxa" w:w="2304"/>
             <w:shd w:fill="FFFFFF"/>
           </w:tcPr>
           <w:p>
             <w:pPr>
-              <w:spacing w:before="40" w:after="40"/>
+              <w:spacing w:before="20" w:after="20"/>
             </w:pPr>
             <w:r>
               <w:rPr>
                 <w:sz w:val="16"/>
               </w:rPr>
-              <w:t>5. Consulta Normativa</w:t>
+              <w:t>Verificación de citas</w:t>
             </w:r>
           </w:p>
         </w:tc>
         <w:tc>
           <w:tcPr>
-            <w:tcW w:type="dxa" w:w="1987"/>
+            <w:tcW w:type="dxa" w:w="2304"/>
             <w:shd w:fill="FFFFFF"/>
           </w:tcPr>
           <w:p>
             <w:pPr>
-              <w:spacing w:before="40" w:after="40"/>
+              <w:spacing w:before="20" w:after="20"/>
             </w:pPr>
             <w:r>
               <w:rPr>
                 <w:sz w:val="16"/>
               </w:rPr>
-              <w:t>Requisitos subsidio FOGAPE</w:t>
+              <w:t>Confiar en el prompt</w:t>
             </w:r>
           </w:p>
         </w:tc>
         <w:tc>
           <w:tcPr>
-            <w:tcW w:type="dxa" w:w="1987"/>
+            <w:tcW w:type="dxa" w:w="5328"/>
             <w:shd w:fill="FFFFFF"/>
           </w:tcPr>
           <w:p>
             <w:pPr>
-              <w:spacing w:before="40" w:after="40"/>
+              <w:spacing w:before="20" w:after="20"/>
             </w:pPr>
             <w:r>
               <w:rPr>
                 <w:sz w:val="16"/>
               </w:rPr>
-              <w:t>Asesoría Informativa</w:t>
+              <w:t>El prompt no garantiza fidelidad; la verificación la mide y la hace visible al ejecutivo.</w:t>
+            </w:r>
+          </w:p>
+        </w:tc>
+      </w:tr>
+      <w:tr>
+        <w:tc>
+          <w:tcPr>
+            <w:tcW w:type="dxa" w:w="2304"/>
+            <w:shd w:fill="F1F5F9"/>
+          </w:tcPr>
+          <w:p>
+            <w:pPr>
+              <w:spacing w:before="20" w:after="20"/>
+            </w:pPr>
+            <w:r>
+              <w:rPr>
+                <w:sz w:val="16"/>
+              </w:rPr>
+              <w:t>Caché + último valor real</w:t>
             </w:r>
           </w:p>
         </w:tc>
         <w:tc>
           <w:tcPr>
-            <w:tcW w:type="dxa" w:w="1987"/>
-            <w:shd w:fill="FFFFFF"/>
+            <w:tcW w:type="dxa" w:w="2304"/>
+            <w:shd w:fill="F1F5F9"/>
           </w:tcPr>
           <w:p>
             <w:pPr>
-              <w:spacing w:before="40" w:after="40"/>
+              <w:spacing w:before="20" w:after="20"/>
             </w:pPr>
             <w:r>
               <w:rPr>
                 <w:sz w:val="16"/>
               </w:rPr>
-              <w:t>Art. 6 (Coberturas 85% y 70%)</w:t>
+              <w:t>Consultar la API siempre</w:t>
             </w:r>
           </w:p>
         </w:tc>
         <w:tc>
           <w:tcPr>
-            <w:tcW w:type="dxa" w:w="1987"/>
-            <w:shd w:fill="FFFFFF"/>
+            <w:tcW w:type="dxa" w:w="5328"/>
+            <w:shd w:fill="F1F5F9"/>
           </w:tcPr>
           <w:p>
             <w:pPr>
-              <w:spacing w:before="40" w:after="40"/>
+              <w:spacing w:before="20" w:after="20"/>
             </w:pPr>
             <w:r>
               <w:rPr>
                 <w:sz w:val="16"/>
               </w:rPr>
-              <w:t>100,0%</w:t>
+              <w:t>Evita la latencia y la caída del servicio sin inventar valores.</w:t>
             </w:r>
           </w:p>
         </w:tc>
@@ -1203,57 +1942,13 @@
     </w:tbl>
     <w:p>
       <w:pPr>
-        <w:spacing w:before="80" w:after="120"/>
+        <w:spacing w:after="0"/>
       </w:pPr>
-      <w:r>
-        <w:rPr>
-          <w:b/>
-        </w:rPr>
-        <w:t xml:space="preserve">Resultados Globales de la Solución: </w:t>
-      </w:r>
-      <w:r>
-        <w:t xml:space="preserve">Precisión de dictamen: </w:t>
-      </w:r>
-      <w:r>
-        <w:rPr>
-          <w:b/>
-        </w:rPr>
-        <w:t>100%</w:t>
-      </w:r>
-      <w:r>
-        <w:t xml:space="preserve"> | Consistencia matemática de UF a $CLP: </w:t>
-      </w:r>
-      <w:r>
-        <w:rPr>
-          <w:b/>
-        </w:rPr>
-        <w:t>100%</w:t>
-      </w:r>
-      <w:r>
-        <w:t xml:space="preserve"> | Score promedio de Groundedness: </w:t>
-      </w:r>
-      <w:r>
-        <w:rPr>
-          <w:b/>
-        </w:rPr>
-        <w:t>100%</w:t>
-      </w:r>
-      <w:r>
-        <w:t xml:space="preserve"> | Latencia de inferencia: </w:t>
-      </w:r>
-      <w:r>
-        <w:rPr>
-          <w:b/>
-        </w:rPr>
-        <w:t>0,0020 segundos</w:t>
-      </w:r>
-      <w:r>
-        <w:t>. Adicionalmente, el repositorio incluye 11 pruebas automatizadas unitarias ejecutadas satisfactoriamente con unittest (test_rag_pipeline.py, test_external_tools.py, test_agent_policies.py); la evidencia de ejecución y capturas del dashboard se encuentran en docs/evidencias del repositorio.</w:t>
-      </w:r>
     </w:p>
     <w:p>
       <w:pPr>
-        <w:spacing w:after="120"/>
+        <w:spacing w:after="80"/>
+        <w:jc w:val="both"/>
       </w:pPr>
       <w:r>
         <w:rPr>
@@ -1262,13 +1957,16 @@
         <w:t xml:space="preserve">Limitaciones: </w:t>
       </w:r>
       <w:r>
-        <w:t>las métricas anteriores se obtuvieron con el motor de síntesis local (modo sin OPENAI_API_KEY), que aplica las reglas del manual de forma determinista; con el LLM activo (gpt-4o-mini) la salida no es determinista y debe re-evaluarse con la misma batería. El índice TF-IDF es léxico, por lo que los puntajes de similitud son bajos (≈10%) y puede recuperar fragmentos poco específicos; se propone migrar a embeddings densos. Los datos del manual y de clientes son simulados.</w:t>
+        <w:rPr>
+          <w:b w:val="0"/>
+        </w:rPr>
+        <w:t>las métricas se midieron con el motor de síntesis local (sin OPENAI_API_KEY); con el LLM activo la redacción no es determinista y debe re-evaluarse con la misma batería. Los puntajes de similitud TF-IDF son moderados (0,2–0,6). Los documentos y clientes son simulados.</w:t>
       </w:r>
     </w:p>
     <w:p>
       <w:pPr>
         <w:pStyle w:val="Heading1"/>
-        <w:spacing w:before="200" w:after="80"/>
+        <w:spacing w:before="160" w:after="60"/>
       </w:pPr>
       <w:r>
         <w:rPr>
@@ -1276,69 +1974,85 @@
           <w:color w:val="003399"/>
           <w:sz w:val="24"/>
         </w:rPr>
-        <w:t>6. Conclusiones y Reflexiones Individuales Obligatorias</w:t>
+        <w:t>6. Conclusiones y Reflexiones Individuales</w:t>
       </w:r>
     </w:p>
     <w:p>
       <w:pPr>
         <w:spacing w:after="80"/>
+        <w:jc w:val="both"/>
       </w:pPr>
       <w:r>
         <w:rPr>
           <w:b/>
         </w:rPr>
-        <w:t xml:space="preserve">Conclusiones del Proyecto: </w:t>
+        <w:t xml:space="preserve">Conclusiones del proyecto: </w:t>
       </w:r>
       <w:r>
+        <w:rPr>
+          <w:b w:val="0"/>
+        </w:rPr>
         <w:t>La implementación de la arquitectura PYME-Advisor demuestra que la combinación de agentes inteligentes, pipelines RAG semánticos y consumo de herramientas en tiempo real resuelve integralmente las deficiencias de los modelos generativos puros en entornos corporativos de alta regulación. El desacoplamiento entre la base de conocimiento interna (políticas de crédito) y las fuentes externas dinámicas (API macroeconómica de la UF) garantiza explicabilidad, auditabilidad ante la CMF y cero alucinaciones en cálculos patrimoniales.</w:t>
       </w:r>
     </w:p>
     <w:p>
       <w:pPr>
         <w:spacing w:after="80"/>
+        <w:jc w:val="both"/>
       </w:pPr>
       <w:r>
         <w:rPr>
           <w:b/>
         </w:rPr>
-        <w:t xml:space="preserve">Reflexión Individual - Juan Serna: </w:t>
+        <w:t xml:space="preserve">Reflexión individual - Juan Serna: </w:t>
       </w:r>
       <w:r>
+        <w:rPr>
+          <w:b w:val="0"/>
+        </w:rPr>
         <w:t>Durante el desarrollo del proyecto, mi principal foco técnico fue estructurar la segmentación jerárquica de los documentos normativos de BancoEstado y validar el almacén vectorial. Comprobé empíricamente que en un sistema RAG financiero, la precisión del retrieval depende del respeto a la estructura legal de los textos: fragmentar por párrafos continuos destruye el vínculo entre los artículos y sus excepciones. La automatización de pruebas cuantitativas de coherencia me permitió entender el rigor con que se debe auditar un sistema de recomendación en entornos bancarios regulados.</w:t>
       </w:r>
     </w:p>
     <w:p>
       <w:pPr>
         <w:spacing w:after="80"/>
+        <w:jc w:val="both"/>
       </w:pPr>
       <w:r>
         <w:rPr>
           <w:b/>
         </w:rPr>
-        <w:t xml:space="preserve">Reflexión Individual - Bárbara Bustamante: </w:t>
+        <w:t xml:space="preserve">Reflexión individual - Bárbara Bustamante: </w:t>
       </w:r>
       <w:r>
+        <w:rPr>
+          <w:b w:val="0"/>
+        </w:rPr>
         <w:t>Mi participación se centró en la orquestación agéntica y la integración de la API externa de indicadores económicos en tiempo real. Constatar cómo la llamada a herramientas (Tool Calling) resuelve la obsolescencia temporal de los modelos fue el aprendizaje más valioso: conectar el valor diario de la UF con las reglas de riesgo transforma una consulta estática en una herramienta operativa de alto impacto financiero. Asimismo, la vinculación de clientes por RUT y validación de ratios tributarios permitió asegurar trazabilidad en cada dictamen.</w:t>
       </w:r>
     </w:p>
     <w:p>
       <w:pPr>
-        <w:spacing w:after="120"/>
+        <w:spacing w:after="80"/>
+        <w:jc w:val="both"/>
       </w:pPr>
       <w:r>
         <w:rPr>
           <w:b/>
         </w:rPr>
-        <w:t xml:space="preserve">Reflexión Individual - Nelson Carrasco: </w:t>
+        <w:t xml:space="preserve">Reflexión individual - Nelson Carrasco: </w:t>
       </w:r>
       <w:r>
+        <w:rPr>
+          <w:b w:val="0"/>
+        </w:rPr>
         <w:t>Mi trabajo se concentró en la ingeniería de prompts, el diseño de guardrails negativos estrictos para evitar alucinaciones y la gestión de memoria conversacional. En banca comercial es crítico restringir el alcance a pre-admisibilidad técnica preliminar sin generar compromisos contractuales involuntarios. Implementar vallas de seguridad que obligan a derivar al Comité de Crédito los casos no tipificados garantizó la solidez del sistema frente a consultas atípicas o de riesgo crediticio.</w:t>
       </w:r>
     </w:p>
     <w:p>
       <w:pPr>
         <w:pStyle w:val="Heading1"/>
-        <w:spacing w:before="160" w:after="80"/>
+        <w:spacing w:before="160" w:after="60"/>
       </w:pPr>
       <w:r>
         <w:rPr>
@@ -1346,12 +2060,13 @@
           <w:color w:val="003399"/>
           <w:sz w:val="22"/>
         </w:rPr>
-        <w:t>7. Declaración de Uso de Inteligencia Artificial y Referencias (APA 7)</w:t>
+        <w:t>7. Declaración de Uso de IA y Referencias (APA 7)</w:t>
       </w:r>
     </w:p>
     <w:p>
       <w:pPr>
         <w:spacing w:after="80"/>
+        <w:jc w:val="both"/>
       </w:pPr>
       <w:r>
         <w:rPr>
@@ -1360,40 +2075,109 @@
         <w:t xml:space="preserve">Uso de IA: </w:t>
       </w:r>
       <w:r>
-        <w:t xml:space="preserve">Conforme a las indicaciones de la evaluación, el equipo declara el uso de herramientas de IA generativa como apoyo: Claude (Anthropic, 2026) se utilizó para revisar la completitud del encargo frente a la pauta, mejorar la redacción del informe y del README, generar los diagramas Mermaid y automatizar la captura de evidencias de prueba. </w:t>
+        <w:rPr>
+          <w:b w:val="0"/>
+        </w:rPr>
+        <w:t xml:space="preserve">conforme a las indicaciones de la evaluación, el equipo declara que utilizó Claude (Anthropic, 2026) para revisar la completitud del encargo frente a la pauta, corregir y ampliar el código (motor de reglas, recuperación multi-consulta, verificación de citas y evaluador), redactar y revisar este informe y el README, generar los diagramas y capturar la evidencia de pruebas. </w:t>
       </w:r>
       <w:r>
         <w:rPr>
           <w:highlight w:val="yellow"/>
         </w:rPr>
-        <w:t>[COMPLETAR: otras herramientas de IA usadas durante el desarrollo del código y para qué.]</w:t>
+        <w:t xml:space="preserve">[COMPLETAR: otras herramientas de IA usadas y para qué.] </w:t>
       </w:r>
       <w:r>
-        <w:t xml:space="preserve"> Todo el contenido generado fue revisado y validado por el equipo; las reflexiones individuales fueron redactadas por cada integrante sin apoyo de IA.</w:t>
+        <w:t xml:space="preserve">Todo el contenido generado fue revisado y validado por el equipo. </w:t>
+      </w:r>
+      <w:r>
+        <w:rPr>
+          <w:highlight w:val="yellow"/>
+        </w:rPr>
+        <w:t>[CONFIRMAR: las conclusiones y reflexiones individuales fueron redactadas por el equipo sin apoyo de IA.]</w:t>
       </w:r>
     </w:p>
     <w:p>
       <w:pPr>
-        <w:spacing w:after="40"/>
+        <w:spacing w:after="20"/>
+        <w:ind w:left="432" w:hanging="432"/>
       </w:pPr>
       <w:r>
         <w:rPr>
-          <w:color w:val="505050"/>
-          <w:sz w:val="16"/>
+          <w:sz w:val="17"/>
         </w:rPr>
-        <w:t>• Anthropic. (2026). Claude (versión Opus 5.5) [Modelo de lenguaje de gran tamaño]. https://claude.ai</w:t>
-        <w:br/>
-        <w:t>• Comisión para el Mercado Financiero [CMF]. (s.f.). Recopilación Actualizada de Normas para Bancos. https://www.cmfchile.cl</w:t>
-        <w:br/>
-        <w:t>• Lewis, P., et al. (2020). Retrieval-Augmented Generation for Knowledge-Intensive NLP Tasks. Advances in Neural Information Processing Systems (NeurIPS), 33, 9459–9474.</w:t>
-        <w:br/>
-        <w:t>• Ministerio de Economía, Fomento y Turismo. (2024). Quinta Encuesta Longitudinal de Empresas (ELE). Gobierno de Chile. https://www.economia.gob.cl</w:t>
-        <w:br/>
-        <w:t>• mindicador.cl. (s.f.). API de indicadores económicos diarios en Chile. https://mindicador.cl</w:t>
-        <w:br/>
-        <w:t>• Shuster, K., Poff, S., Chen, M., Kiela, D., &amp; Weston, J. (2021). Retrieval Augmentation Reduces Hallucination in Conversation. Findings of the Association for Computational Linguistics: EMNLP 2021, 3784–3803.</w:t>
-        <w:br/>
-        <w:t>• Yao, S., et al. (2023). ReAct: Synergizing Reasoning and Acting in Language Models. International Conference on Learning Representations (ICLR).</w:t>
+        <w:t>Anthropic. (2026). Claude (versión Opus 5.5) [Modelo de lenguaje de gran tamaño]. https://claude.ai</w:t>
+      </w:r>
+    </w:p>
+    <w:p>
+      <w:pPr>
+        <w:spacing w:after="20"/>
+        <w:ind w:left="432" w:hanging="432"/>
+      </w:pPr>
+      <w:r>
+        <w:rPr>
+          <w:sz w:val="17"/>
+        </w:rPr>
+        <w:t>Comisión para el Mercado Financiero. (s.f.). Recopilación Actualizada de Normas de Bancos (RAN). https://www.cmfchile.cl/portal/principal/613/w3-propertyvalue-29580.html</w:t>
+      </w:r>
+    </w:p>
+    <w:p>
+      <w:pPr>
+        <w:spacing w:after="20"/>
+        <w:ind w:left="432" w:hanging="432"/>
+      </w:pPr>
+      <w:r>
+        <w:rPr>
+          <w:sz w:val="17"/>
+        </w:rPr>
+        <w:t>Lewis, P., Perez, E., Piktus, A., Petroni, F., Karpukhin, V., Goyal, N., Küttler, H., Lewis, M., Yih, W., Rocktäschel, T., Riedel, S., &amp; Kiela, D. (2020). Retrieval-augmented generation for knowledge-intensive NLP tasks. Advances in Neural Information Processing Systems, 33, 9459–9474.</w:t>
+      </w:r>
+    </w:p>
+    <w:p>
+      <w:pPr>
+        <w:spacing w:after="20"/>
+        <w:ind w:left="432" w:hanging="432"/>
+      </w:pPr>
+      <w:r>
+        <w:rPr>
+          <w:sz w:val="17"/>
+        </w:rPr>
+        <w:t>mindicador.cl. (s.f.). API de indicadores económicos diarios en Chile. https://mindicador.cl</w:t>
+      </w:r>
+    </w:p>
+    <w:p>
+      <w:pPr>
+        <w:spacing w:after="20"/>
+        <w:ind w:left="432" w:hanging="432"/>
+      </w:pPr>
+      <w:r>
+        <w:rPr>
+          <w:sz w:val="17"/>
+        </w:rPr>
+        <w:t>Ministerio de Economía, Fomento y Turismo. (2026). MiPymes y emprendimiento. https://www.economia.gob.cl/wp-content/uploads/2026/02/10-03-26-mipymes-y-emprendimiento.pdf</w:t>
+      </w:r>
+    </w:p>
+    <w:p>
+      <w:pPr>
+        <w:spacing w:after="20"/>
+        <w:ind w:left="432" w:hanging="432"/>
+      </w:pPr>
+      <w:r>
+        <w:rPr>
+          <w:sz w:val="17"/>
+        </w:rPr>
+        <w:t>Shuster, K., Poff, S., Chen, M., Kiela, D., &amp; Weston, J. (2021). Retrieval augmentation reduces hallucination in conversation. En Findings of the Association for Computational Linguistics: EMNLP 2021 (pp. 3784–3803).</w:t>
+      </w:r>
+    </w:p>
+    <w:p>
+      <w:pPr>
+        <w:spacing w:after="20"/>
+        <w:ind w:left="432" w:hanging="432"/>
+      </w:pPr>
+      <w:r>
+        <w:rPr>
+          <w:sz w:val="17"/>
+        </w:rPr>
+        <w:t>Yao, S., Zhao, J., Yu, D., Du, N., Shafran, I., Narasimhan, K., &amp; Cao, Y. (2023). ReAct: Synergizing reasoning and acting in language models. International Conference on Learning Representations (ICLR 2023).</w:t>
       </w:r>
     </w:p>
     <w:sectPr>
@@ -1772,7 +2556,7 @@
     <w:rPr>
       <w:rFonts w:ascii="Calibri" w:hAnsi="Calibri"/>
       <w:color w:val="282828"/>
-      <w:sz w:val="21"/>
+      <w:sz w:val="20"/>
     </w:rPr>
   </w:style>
   <w:style w:type="paragraph" w:styleId="Header">

</xml_diff>